<commit_message>
docs(artigo): integrar atualizacoes arquiteturais, tabela priorizada no docx e alinhar sketch esteiras ab
</commit_message>
<xml_diff>
--- a/docs/artigo/Projeto de pesquisa - Final.docx
+++ b/docs/artigo/Projeto de pesquisa - Final.docx
@@ -1,5 +1,67 @@
 
-<file path=word/document.xml><?xml version="1.0" encoding="utf-8"?>
+<file path=customXml\item1.xml><?xml version="1.0" encoding="utf-8"?>
+<b:Sources xmlns:b="http://schemas.openxmlformats.org/officeDocument/2006/bibliography" xmlns="http://schemas.openxmlformats.org/officeDocument/2006/bibliography" SelectedStyle="\APA.XSL" StyleName="APA"/>
+</file>
+
+<file path=customXml\itemProps1.xml><?xml version="1.0" encoding="utf-8"?>
+<ds:datastoreItem xmlns:ds="http://schemas.openxmlformats.org/officeDocument/2006/customXml" ds:itemID="{EE4BC9EC-644D-4D87-AFC8-3A05FD12D9F8}">
+  <ds:schemaRefs>
+    <ds:schemaRef ds:uri="http://schemas.openxmlformats.org/officeDocument/2006/bibliography"/>
+  </ds:schemaRefs>
+</ds:datastoreItem>
+</file>
+
+<file path=docProps\app.xml><?xml version="1.0" encoding="utf-8"?>
+<Properties xmlns="http://schemas.openxmlformats.org/officeDocument/2006/extended-properties" xmlns:vt="http://schemas.openxmlformats.org/officeDocument/2006/docPropsVTypes">
+  <Template>Normal</Template>
+  <TotalTime>153</TotalTime>
+  <Pages>15</Pages>
+  <Words>3933</Words>
+  <Characters>21243</Characters>
+  <Application>Microsoft Office Word</Application>
+  <DocSecurity>0</DocSecurity>
+  <Lines>177</Lines>
+  <Paragraphs>50</Paragraphs>
+  <ScaleCrop>false</ScaleCrop>
+  <HeadingPairs>
+    <vt:vector size="2" baseType="variant">
+      <vt:variant>
+        <vt:lpstr>Título</vt:lpstr>
+      </vt:variant>
+      <vt:variant>
+        <vt:i4>1</vt:i4>
+      </vt:variant>
+    </vt:vector>
+  </HeadingPairs>
+  <TitlesOfParts>
+    <vt:vector size="1" baseType="lpstr">
+      <vt:lpstr>ESCREVA AQUI O TÍTULO DO SEU PEDIDO DE PATENTE</vt:lpstr>
+    </vt:vector>
+  </TitlesOfParts>
+  <Company>INPI</Company>
+  <LinksUpToDate>false</LinksUpToDate>
+  <CharactersWithSpaces>25126</CharactersWithSpaces>
+  <SharedDoc>false</SharedDoc>
+  <HyperlinksChanged>false</HyperlinksChanged>
+  <AppVersion>16.0000</AppVersion>
+</Properties>
+</file>
+
+<file path=docProps\core.xml><?xml version="1.0" encoding="utf-8"?>
+<cp:coreProperties xmlns:cp="http://schemas.openxmlformats.org/package/2006/metadata/core-properties" xmlns:dc="http://purl.org/dc/elements/1.1/" xmlns:dcterms="http://purl.org/dc/terms/" xmlns:dcmitype="http://purl.org/dc/dcmitype/" xmlns:xsi="http://www.w3.org/2001/XMLSchema-instance">
+  <dc:title>ESCREVA AQUI O TÍTULO DO SEU PEDIDO DE PATENTE</dc:title>
+  <dc:subject/>
+  <dc:creator>Matheus Nespolo Silva</dc:creator>
+  <cp:keywords/>
+  <dc:description/>
+  <cp:lastModifiedBy>MATHEUS NESPOLO SILVA</cp:lastModifiedBy>
+  <cp:revision>24</cp:revision>
+  <dcterms:created xsi:type="dcterms:W3CDTF">2026-05-11T22:29:00Z</dcterms:created>
+  <dcterms:modified xsi:type="dcterms:W3CDTF">2026-08-18T23:52:00Z</dcterms:modified>
+</cp:coreProperties>
+</file>
+
+<file path=word\document.xml><?xml version="1.0" encoding="utf-8"?>
 <w:document xmlns:wpc="http://schemas.microsoft.com/office/word/2010/wordprocessingCanvas" xmlns:cx="http://schemas.microsoft.com/office/drawing/2014/chartex" xmlns:cx1="http://schemas.microsoft.com/office/drawing/2015/9/8/chartex" xmlns:cx2="http://schemas.microsoft.com/office/drawing/2015/10/21/chartex" xmlns:cx3="http://schemas.microsoft.com/office/drawing/2016/5/9/chartex" xmlns:cx4="http://schemas.microsoft.com/office/drawing/2016/5/10/chartex" xmlns:cx5="http://schemas.microsoft.com/office/drawing/2016/5/11/chartex" xmlns:cx6="http://schemas.microsoft.com/office/drawing/2016/5/12/chartex" xmlns:cx7="http://schemas.microsoft.com/office/drawing/2016/5/13/chartex" xmlns:cx8="http://schemas.microsoft.com/office/drawing/2016/5/14/chartex" xmlns:mc="http://schemas.openxmlformats.org/markup-compatibility/2006" xmlns:aink="http://schemas.microsoft.com/office/drawing/2016/ink" xmlns:am3d="http://schemas.microsoft.com/office/drawing/2017/model3d" xmlns:o="urn:schemas-microsoft-com:office:office" xmlns:oel="http://schemas.microsoft.com/office/2019/extlst" xmlns:r="http://schemas.openxmlformats.org/officeDocument/2006/relationships" xmlns:m="http://schemas.openxmlformats.org/officeDocument/2006/math" xmlns:v="urn:schemas-microsoft-com:vml" xmlns:wp14="http://schemas.microsoft.com/office/word/2010/wordprocessingDrawing" xmlns:wp="http://schemas.openxmlformats.org/drawingml/2006/wordprocessingDrawing" xmlns:w10="urn:schemas-microsoft-com:office:word" xmlns:w="http://schemas.openxmlformats.org/wordprocessingml/2006/main" xmlns:w14="http://schemas.microsoft.com/office/word/2010/wordml" xmlns:w15="http://schemas.microsoft.com/office/word/2012/wordml" xmlns:w16cei="http://schemas.microsoft.com/office/word/2026/wordml/cei" xmlns:w16cex="http://schemas.microsoft.com/office/word/2018/wordml/cex" xmlns:w16cid="http://schemas.microsoft.com/office/word/2016/wordml/cid" xmlns:w16="http://schemas.microsoft.com/office/word/2018/wordml" xmlns:w16du="http://schemas.microsoft.com/office/word/2023/wordml/word16du" xmlns:w16sdtdh="http://schemas.microsoft.com/office/word/2020/wordml/sdtdatahash" xmlns:w16sdtfl="http://schemas.microsoft.com/office/word/2024/wordml/sdtformatlock" xmlns:w16se="http://schemas.microsoft.com/office/word/2015/wordml/symex" xmlns:wpg="http://schemas.microsoft.com/office/word/2010/wordprocessingGroup" xmlns:wpi="http://schemas.microsoft.com/office/word/2010/wordprocessingInk" xmlns:wne="http://schemas.microsoft.com/office/word/2006/wordml" xmlns:wps="http://schemas.microsoft.com/office/word/2010/wordprocessingShape" mc:Ignorable="w14 w15 w16se w16cid w16 w16cex w16sdtdh w16sdtfl w16du wp14">
   <w:body>
     <w:p>
@@ -2150,14 +2212,28 @@
         <w:rPr>
           <w:rFonts w:ascii="Arial" w:hAnsi="Arial" w:cs="Arial"/>
           <w:color w:val="000000" w:themeColor="text1"/>
-        </w:rPr>
-      </w:pPr>
-      <w:r>
-        <w:rPr>
-          <w:rFonts w:ascii="Arial" w:hAnsi="Arial" w:cs="Arial"/>
-          <w:color w:val="000000" w:themeColor="text1"/>
-        </w:rPr>
-        <w:t>Substituição do Arduino Mega pelo Arduino Uno. A troca do driver de motores L298N (que exige três pinos por motor: ENA, IN1 e IN2) por quatro módulos MOSFET IRF520 (um único pino PWM por motor) reduziu a demanda de E/S de doze para quatro pinos de controle de motores. Como os motores DC 3–6 V das esteiras operam em sentido único, a ponte H completa do L298N era desnecessária; além disso, a queda de tensão interna do L298N (aproximadamente 2 V) é crítica para motores de baixa tensão, problema eliminado pelo acionamento por MOSFET. Com a redução de pinos, o Arduino Uno tornou-se suficiente, reduzindo o custo do protótipo e reforçando o objetivo de viabilidade econômica do projeto.</w:t>
+          <w:sz w:val="24"/>
+          <w:szCs w:val="24"/>
+        </w:rPr>
+      </w:pPr>
+      <w:r>
+        <w:rPr>
+          <w:rFonts w:ascii="Arial" w:hAnsi="Arial" w:cs="Arial"/>
+          <w:b/>
+          <w:color w:val="000000" w:themeColor="text1"/>
+          <w:sz w:val="24"/>
+          <w:szCs w:val="24"/>
+        </w:rPr>
+        <w:t xml:space="preserve">a) Substituição do driver de motores e microcontrolador (Arduino Uno e MOSFET IRF520): </w:t>
+      </w:r>
+      <w:r>
+        <w:rPr>
+          <w:rFonts w:ascii="Arial" w:hAnsi="Arial" w:cs="Arial"/>
+          <w:color w:val="000000" w:themeColor="text1"/>
+          <w:sz w:val="24"/>
+          <w:szCs w:val="24"/>
+        </w:rPr>
+        <w:t xml:space="preserve">A troca do driver L298N (que exige três pinos por motor: ENA, IN1 e IN2) por módulos MOSFET IRF520 (um único pino PWM por motor) reduziu a demanda de E/S de doze para quatro pinos de controle. Como os motores DC 3–6 V operam em sentido único, a ponte H completa do L298N era desnecessária; ademais, a queda de tensão interna de aproximadamente 2 V no L298N degradava substancialmente o torque em baixa tensão, problema totalmente eliminado pela condução por efeito de campo do MOSFET. A esteira principal foi configurada com ligação direta à alimentação CC, simplificando o controle. Essa racionalização viabilizou o uso do Arduino Uno em substituição ao Mega, barateando o protótipo e consolidando a viabilidade econômica do sistema.</w:t>
       </w:r>
     </w:p>
     <w:p>
@@ -2167,14 +2243,28 @@
         <w:rPr>
           <w:rFonts w:ascii="Arial" w:hAnsi="Arial" w:cs="Arial"/>
           <w:color w:val="000000" w:themeColor="text1"/>
-        </w:rPr>
-      </w:pPr>
-      <w:r>
-        <w:rPr>
-          <w:rFonts w:ascii="Arial" w:hAnsi="Arial" w:cs="Arial"/>
-          <w:color w:val="000000" w:themeColor="text1"/>
-        </w:rPr>
-        <w:t>Remoção dos botões físicos e controle exclusivo via dashboard. Os quatro botões físicos previstos inicialmente foram desabilitados, e a solicitação de peças passou a ser feita exclusivamente pela interface web. A mudança elimina hardware redundante e, principalmente, demonstra na prática o objetivo central do projeto: o controle remoto do processo de intralogística por meio de tecnologias IoT.</w:t>
+          <w:sz w:val="24"/>
+          <w:szCs w:val="24"/>
+        </w:rPr>
+      </w:pPr>
+      <w:r>
+        <w:rPr>
+          <w:rFonts w:ascii="Arial" w:hAnsi="Arial" w:cs="Arial"/>
+          <w:b/>
+          <w:color w:val="000000" w:themeColor="text1"/>
+          <w:sz w:val="24"/>
+          <w:szCs w:val="24"/>
+        </w:rPr>
+        <w:t xml:space="preserve">b) Remapeamento de sensores e isolamento de barramento I2C: </w:t>
+      </w:r>
+      <w:r>
+        <w:rPr>
+          <w:rFonts w:ascii="Arial" w:hAnsi="Arial" w:cs="Arial"/>
+          <w:color w:val="000000" w:themeColor="text1"/>
+          <w:sz w:val="24"/>
+          <w:szCs w:val="24"/>
+        </w:rPr>
+        <w:t xml:space="preserve">Inicialmente alocados nas portas analógicas A4 e A5, os sensores ópticos de junção J2 e J3 foram remapeados para os pinos digitais D2 e D4. Essa decisão isolou completamente os pinos A4 (SDA) e A5 (SCL), garantindo a integridade elétrica e temporal do barramento I2C utilizado pelo display LCD 16x2, prevenindo travamentos do microcontrolador e colisões de sinal entre leitura digital e comunicação serial do display.</w:t>
       </w:r>
     </w:p>
     <w:p>
@@ -2184,22 +2274,28 @@
         <w:rPr>
           <w:rFonts w:ascii="Arial" w:hAnsi="Arial" w:cs="Arial"/>
           <w:color w:val="000000" w:themeColor="text1"/>
-        </w:rPr>
-      </w:pPr>
-      <w:r>
-        <w:rPr>
-          <w:rFonts w:ascii="Arial" w:hAnsi="Arial" w:cs="Arial"/>
-          <w:color w:val="000000" w:themeColor="text1"/>
-        </w:rPr>
-        <w:t xml:space="preserve">Protocolo de comunicação serial em JSON. O formato inicial de publicação (MQTT|tipo:A|estoqueA:4|...) foi substituído por mensagens JSON estruturadas — por </w:t>
-      </w:r>
-      <w:r>
-        <w:rPr>
-          <w:rFonts w:ascii="Arial" w:hAnsi="Arial" w:cs="Arial"/>
-          <w:color w:val="000000" w:themeColor="text1"/>
-        </w:rPr>
-        <w:lastRenderedPageBreak/>
-        <w:t>exemplo, {"type":"estoque","pecaA":4,"pecaB":5,"pecaC":5} — interpretadas com a biblioteca ArduinoJson. O campo "type" permite ao gateway rotear cada mensagem para o tópico MQTT correspondente (dataflow/status, dataflow/estoque, dataflow/eventos, dataflow/sensores e dataflow/esteiras), tornando o protocolo robusto ao parsing, extensível e alinhado a práticas consolidadas de integração IoT.</w:t>
+          <w:sz w:val="24"/>
+          <w:szCs w:val="24"/>
+        </w:rPr>
+      </w:pPr>
+      <w:r>
+        <w:rPr>
+          <w:rFonts w:ascii="Arial" w:hAnsi="Arial" w:cs="Arial"/>
+          <w:b/>
+          <w:color w:val="000000" w:themeColor="text1"/>
+          <w:sz w:val="24"/>
+          <w:szCs w:val="24"/>
+        </w:rPr>
+        <w:t xml:space="preserve">c) Condicionamento de sinais UART e integridade física (Divisor 1k/2kΩ e GND comum): </w:t>
+      </w:r>
+      <w:r>
+        <w:rPr>
+          <w:rFonts w:ascii="Arial" w:hAnsi="Arial" w:cs="Arial"/>
+          <w:color w:val="000000" w:themeColor="text1"/>
+          <w:sz w:val="24"/>
+          <w:szCs w:val="24"/>
+        </w:rPr>
+        <w:t xml:space="preserve">Para viabilizar a comunicação assíncrona entre o microcontrolador Arduino Uno (5 V) e o módulo ESP32 (nível lógico 3,3 V), foi projetado e inserido um divisor de tensão resistivo (1 kΩ / 2 kΩ) na linha TX Uno → RX2 ESP32 (GPIO16), além do estabelecimento compulsório de um plano de terra unificado (GND comum). Essa proteção impede danos por sobretensão nas entradas do ESP32 e erradica flutuações de potencial que ocasionavam corrupção de caracteres e perda de sincronismo serial.</w:t>
       </w:r>
     </w:p>
     <w:p>
@@ -2209,14 +2305,28 @@
         <w:rPr>
           <w:rFonts w:ascii="Arial" w:hAnsi="Arial" w:cs="Arial"/>
           <w:color w:val="000000" w:themeColor="text1"/>
-        </w:rPr>
-      </w:pPr>
-      <w:r>
-        <w:rPr>
-          <w:rFonts w:ascii="Arial" w:hAnsi="Arial" w:cs="Arial"/>
-          <w:color w:val="000000" w:themeColor="text1"/>
-        </w:rPr>
-        <w:t>Gateway ESP32 dedicado. O ESP32 atua como ponte Serial–MQTT: recebe as linhas JSON do Arduino Uno pela UART2 (9600 baud, com divisor de tensão 5 V para 3,3 V no sentido Uno–ESP32), publica nos tópicos MQTT e, no sentido inverso, converte comandos recebidos do broker (tópico dataflow/comandos/sub) em instruções textuais para o Arduino (CMD:PECA:A, CMD:RESET). O gateway configura ainda uma mensagem LWT (Last Will and Testament) retida com QoS 1, permitindo que o dashboard detecte em tempo real a queda do hardware (gateway offline) — um ganho direto de confiabilidade, viabilizado pelo próprio protocolo MQTT (OASIS, 2019).</w:t>
+          <w:sz w:val="24"/>
+          <w:szCs w:val="24"/>
+        </w:rPr>
+      </w:pPr>
+      <w:r>
+        <w:rPr>
+          <w:rFonts w:ascii="Arial" w:hAnsi="Arial" w:cs="Arial"/>
+          <w:b/>
+          <w:color w:val="000000" w:themeColor="text1"/>
+          <w:sz w:val="24"/>
+          <w:szCs w:val="24"/>
+        </w:rPr>
+        <w:t xml:space="preserve">d) Protocolo serial em JSON e parser não-bloqueante: </w:t>
+      </w:r>
+      <w:r>
+        <w:rPr>
+          <w:rFonts w:ascii="Arial" w:hAnsi="Arial" w:cs="Arial"/>
+          <w:color w:val="000000" w:themeColor="text1"/>
+          <w:sz w:val="24"/>
+          <w:szCs w:val="24"/>
+        </w:rPr>
+        <w:t xml:space="preserve">O formato textual delimitado inicial foi substituído por mensagens JSON estruturadas com chave discriminadora "type" (ex.: {"type":"estoque","pecaA":4,"pecaB":5,"pecaC":5}), desserializadas no ESP32 via biblioteca ArduinoJson. No firmware do Uno, a rotina de leitura bloqueante Serial.readStringUntil() foi substituída por um acumulador serial orientado a quebras de linha (\n), eliminando congelamentos da máquina de estados. O firmware incorporou ainda o tratamento robusto por prefixo (startsWith) para o comando CMD:RESET e o envio padronizado de rejeições explícitas (peca_invalida, ocupado, comando_desconhecido).</w:t>
       </w:r>
     </w:p>
     <w:p>
@@ -2226,30 +2336,28 @@
         <w:rPr>
           <w:rFonts w:ascii="Arial" w:hAnsi="Arial" w:cs="Arial"/>
           <w:color w:val="000000" w:themeColor="text1"/>
-        </w:rPr>
-      </w:pPr>
-      <w:r>
-        <w:rPr>
-          <w:rFonts w:ascii="Arial" w:hAnsi="Arial" w:cs="Arial"/>
-          <w:color w:val="000000" w:themeColor="text1"/>
-        </w:rPr>
-        <w:t>Substituição do Node-RED/</w:t>
-      </w:r>
-      <w:proofErr w:type="spellStart"/>
-      <w:r>
-        <w:rPr>
-          <w:rFonts w:ascii="Arial" w:hAnsi="Arial" w:cs="Arial"/>
-          <w:color w:val="000000" w:themeColor="text1"/>
-        </w:rPr>
-        <w:t>Ubidots</w:t>
-      </w:r>
-      <w:proofErr w:type="spellEnd"/>
-      <w:r>
-        <w:rPr>
-          <w:rFonts w:ascii="Arial" w:hAnsi="Arial" w:cs="Arial"/>
-          <w:color w:val="000000" w:themeColor="text1"/>
-        </w:rPr>
-        <w:t xml:space="preserve"> por servidor Node.js próprio. Em lugar das plataformas de visualização de terceiros consideradas inicialmente, foi desenvolvido um servidor em Node.js (Express + Socket.IO + mqtt.js) que atua como relay entre MQTT e WebSocket (FETTE; MELNIKOV, 2011), servindo um dashboard web em HTML/CSS/JavaScript com diagrama interativo, botões de controle remoto e histórico de eventos. A decisão garante controle total da interface, latência reduzida na atualização em tempo real e independência de planos pagos de plataformas proprietárias — coerente com a proposta de democratização do acesso à automação.</w:t>
+          <w:sz w:val="24"/>
+          <w:szCs w:val="24"/>
+        </w:rPr>
+      </w:pPr>
+      <w:r>
+        <w:rPr>
+          <w:rFonts w:ascii="Arial" w:hAnsi="Arial" w:cs="Arial"/>
+          <w:b/>
+          <w:color w:val="000000" w:themeColor="text1"/>
+          <w:sz w:val="24"/>
+          <w:szCs w:val="24"/>
+        </w:rPr>
+        <w:t xml:space="preserve">e) Calibração temporal da FSM e controle de transição de peças: </w:t>
+      </w:r>
+      <w:r>
+        <w:rPr>
+          <w:rFonts w:ascii="Arial" w:hAnsi="Arial" w:cs="Arial"/>
+          <w:color w:val="000000" w:themeColor="text1"/>
+          <w:sz w:val="24"/>
+          <w:szCs w:val="24"/>
+        </w:rPr>
+        <w:t xml:space="preserve">A temporização crítica da máquina de estados foi recalibrada experimentalmente: o parâmetro TIMEOUT_ENTREGA foi estendido de 3.000 ms para 9.000 ms, acomodando com ampla margem o tempo real de deslocamento físico da peça (~5 s até o sensor). Implementou-se adicionalmente o parâmetro TEMPO_SAIDA_ESTEIRA_MS (3.000 ms não-bloqueante), assegurando que o objeto complete a transição da esteira secundária para a esteira principal antes do retorno ao estado AGUARDANDO_PEDIDO, eliminando falsos positivos de erro por timeout.</w:t>
       </w:r>
     </w:p>
     <w:p>
@@ -2259,14 +2367,28 @@
         <w:rPr>
           <w:rFonts w:ascii="Arial" w:hAnsi="Arial" w:cs="Arial"/>
           <w:color w:val="000000" w:themeColor="text1"/>
-        </w:rPr>
-      </w:pPr>
-      <w:r>
-        <w:rPr>
-          <w:rFonts w:ascii="Arial" w:hAnsi="Arial" w:cs="Arial"/>
-          <w:color w:val="000000" w:themeColor="text1"/>
-        </w:rPr>
-        <w:t>Estratégia dual de broker MQTT. A arquitetura suporta dois modos de operação, selecionáveis por configuração: broker local Eclipse Mosquitto (LIGHT, 2017), na porta 1883 e sem TLS, para desenvolvimento e demonstração em bancada; e broker em nuvem HiveMQ Cloud, na porta 8883, com TLS e autenticação, para o cenário de produção — atendendo ao objetivo de gerenciamento de dados na nuvem com tráfego seguro. A escolha do MQTT como protocolo de transporte fundamenta-se em seu baixo overhead e adequação a dispositivos de recursos restritos, com desempenho superior ao HTTP em cenários IoT (MISHRA; KERTESZ, 2020; NAIK, 2017).</w:t>
+          <w:sz w:val="24"/>
+          <w:szCs w:val="24"/>
+        </w:rPr>
+      </w:pPr>
+      <w:r>
+        <w:rPr>
+          <w:rFonts w:ascii="Arial" w:hAnsi="Arial" w:cs="Arial"/>
+          <w:b/>
+          <w:color w:val="000000" w:themeColor="text1"/>
+          <w:sz w:val="24"/>
+          <w:szCs w:val="24"/>
+        </w:rPr>
+        <w:t xml:space="preserve">f) Sincronismo de estado distribuído e retenção de telemetria: </w:t>
+      </w:r>
+      <w:r>
+        <w:rPr>
+          <w:rFonts w:ascii="Arial" w:hAnsi="Arial" w:cs="Arial"/>
+          <w:color w:val="000000" w:themeColor="text1"/>
+          <w:sz w:val="24"/>
+          <w:szCs w:val="24"/>
+        </w:rPr>
+        <w:t xml:space="preserve">Para assegurar que novos clientes web ou reinicializações do sistema reflitam imediatamente a situação física da planta, o sketch do Arduino passa a disparar a telemetria de estoque com flag Retained no tópico dataflow/estoque logo no setup() e imediatamente após a recuperação por CMD:RESET. Esse mecanismo garante que qualquer interface conectada em cold-start receba o inventário real sem depender de um novo acionamento mecânico, mantendo paridade com o display LCD local.</w:t>
       </w:r>
     </w:p>
     <w:p>
@@ -2276,14 +2398,28 @@
         <w:rPr>
           <w:rFonts w:ascii="Arial" w:hAnsi="Arial" w:cs="Arial"/>
           <w:color w:val="000000" w:themeColor="text1"/>
-        </w:rPr>
-      </w:pPr>
-      <w:r>
-        <w:rPr>
-          <w:rFonts w:ascii="Arial" w:hAnsi="Arial" w:cs="Arial"/>
-          <w:color w:val="000000" w:themeColor="text1"/>
-        </w:rPr>
-        <w:t>g) Simulador offline. Foi implementado um simulador em JavaScript que reproduz integralmente a máquina de estados do Arduino, servindo o mesmo dashboard sem necessidade de hardware ou broker. O simulador permitiu desenvolver e validar o front-end em paralelo à montagem física, desacoplando as frentes de trabalho definidas na metodologia (mecânica, elétrica, programação e documentação).</w:t>
+          <w:sz w:val="24"/>
+          <w:szCs w:val="24"/>
+        </w:rPr>
+      </w:pPr>
+      <w:r>
+        <w:rPr>
+          <w:rFonts w:ascii="Arial" w:hAnsi="Arial" w:cs="Arial"/>
+          <w:b/>
+          <w:color w:val="000000" w:themeColor="text1"/>
+          <w:sz w:val="24"/>
+          <w:szCs w:val="24"/>
+        </w:rPr>
+        <w:t xml:space="preserve">g) Gateway ESP32 dedicado e detecção de falha por LWT (Last Will and Testament): </w:t>
+      </w:r>
+      <w:r>
+        <w:rPr>
+          <w:rFonts w:ascii="Arial" w:hAnsi="Arial" w:cs="Arial"/>
+          <w:color w:val="000000" w:themeColor="text1"/>
+          <w:sz w:val="24"/>
+          <w:szCs w:val="24"/>
+        </w:rPr>
+        <w:t xml:space="preserve">O microcontrolador ESP32 opera como gateway bidirecional de alta disponibilidade: na direção ascendente, converte os pacotes seriais do Uno em publicações MQTT; na direção descendente, traduz comandos do tópico dataflow/comandos/sub em diretivas textuais (CMD:PECA:A, CMD:RESET). O módulo registra perante o broker MQTT uma mensagem LWT com QoS 1 e retenção em dataflow/status, permitindo que a aplicação web e os operadores identifiquem instantaneamente a queda de energia ou falha de conectividade do gateway físico (OASIS, 2019).</w:t>
       </w:r>
     </w:p>
     <w:p>
@@ -2293,15 +2429,28 @@
         <w:rPr>
           <w:rFonts w:ascii="Arial" w:hAnsi="Arial" w:cs="Arial"/>
           <w:color w:val="000000" w:themeColor="text1"/>
-        </w:rPr>
-      </w:pPr>
-      <w:r>
-        <w:rPr>
-          <w:rFonts w:ascii="Arial" w:hAnsi="Arial" w:cs="Arial"/>
-          <w:color w:val="000000" w:themeColor="text1"/>
-        </w:rPr>
-        <w:lastRenderedPageBreak/>
-        <w:t>h) Metodologia de testes incremental. Foi elaborado um plano formal de testes, dividido em três blocos: (i) testes de componentes isolados — B0.1 (setup da placa), B0.2 (sensor IR TCRT5000) e B0.3 (motor DC com IRF520); (ii) testes de bancada integrados — B1 (ciclo completo de entrega), B2 (rejeição por falta de estoque) e B3 (display LCD I2C); e (iii) testes da cadeia de comunicação — Teste 1 (Serial Arduino–ESP32), Teste 2 (ESP32 – broker – Node.js), Teste 3 (comando remoto via cliente MQTT), Teste 4 (End-to-End pelo dashboard) e Teste 5 (FSM completa com duas esteiras, incluindo cenários de rejeição, ocupação e timeout). Cada teste possui materiais, procedimento, critérios de validação e tabela de troubleshooting. O Teste 1 foi executado e aprovado em 12/08/2026, com recepção correta das mensagens JSON pelo ESP32. Uma sonda MQTT em Node.js (mqtt_probe) foi desenvolvida para registrar, com timestamp, todas as mensagens trafegadas nos tópicos do projeto, servindo como evidência experimental para o artigo final.</w:t>
+          <w:sz w:val="24"/>
+          <w:szCs w:val="24"/>
+        </w:rPr>
+      </w:pPr>
+      <w:r>
+        <w:rPr>
+          <w:rFonts w:ascii="Arial" w:hAnsi="Arial" w:cs="Arial"/>
+          <w:b/>
+          <w:color w:val="000000" w:themeColor="text1"/>
+          <w:sz w:val="24"/>
+          <w:szCs w:val="24"/>
+        </w:rPr>
+        <w:t xml:space="preserve">h) Isolamento de tópicos de status e ciclo de vida: </w:t>
+      </w:r>
+      <w:r>
+        <w:rPr>
+          <w:rFonts w:ascii="Arial" w:hAnsi="Arial" w:cs="Arial"/>
+          <w:color w:val="000000" w:themeColor="text1"/>
+          <w:sz w:val="24"/>
+          <w:szCs w:val="24"/>
+        </w:rPr>
+        <w:t xml:space="preserve">A arquitetura de mensageria foi segregada entre o hardware e a camada de software: a telemetria do gateway físico reside estritamente em dataflow/status, enquanto a conectividade do backend Node.js reside em dataflow/status/server. Essa separação impede a colisão de mensagens retidas no broker, prevenindo que o servidor web sobrescreva a condição real de hardware do ESP32 e garantindo a fidedignidade dos indicadores visuais do dashboard.</w:t>
       </w:r>
     </w:p>
     <w:p>
@@ -2311,17 +2460,2082 @@
         <w:rPr>
           <w:rFonts w:ascii="Arial" w:hAnsi="Arial" w:cs="Arial"/>
           <w:color w:val="000000" w:themeColor="text1"/>
-        </w:rPr>
-      </w:pPr>
-      <w:r>
-        <w:rPr>
-          <w:rFonts w:ascii="Arial" w:hAnsi="Arial" w:cs="Arial"/>
-          <w:color w:val="000000" w:themeColor="text1"/>
-        </w:rPr>
-        <w:t>i) Trabalhos correlatos não acadêmicos. Complementarmente à revisão bibliográfica, foi realizada uma busca por propostas semelhantes divulgadas em plataformas abertas (YouTube). Foram identificados projetos de esteiras transportadoras com Arduino e ESP8266/ESP32 conectadas a dashboards IoT (vídeos listados nas referências), além de sistemas de classificação de objetos em esteira com monitoramento em nuvem. Nenhuma das propostas encontradas combina, em um único sistema de baixo custo, a máquina de estados determinística no microcontrolador, o gateway MQTT com detecção de queda por LWT, o servidor web próprio com WebSocket e o simulador offline da planta — combinação que constitui o diferencial técnico deste trabalho frente ao estado da técnica informal.</w:t>
-      </w:r>
-    </w:p>
-    <w:p/>
+          <w:sz w:val="24"/>
+          <w:szCs w:val="24"/>
+        </w:rPr>
+      </w:pPr>
+      <w:r>
+        <w:rPr>
+          <w:rFonts w:ascii="Arial" w:hAnsi="Arial" w:cs="Arial"/>
+          <w:b/>
+          <w:color w:val="000000" w:themeColor="text1"/>
+          <w:sz w:val="24"/>
+          <w:szCs w:val="24"/>
+        </w:rPr>
+        <w:t xml:space="preserve">i) Servidor Node.js próprio, WebSockets e camada de observabilidade: </w:t>
+      </w:r>
+      <w:r>
+        <w:rPr>
+          <w:rFonts w:ascii="Arial" w:hAnsi="Arial" w:cs="Arial"/>
+          <w:color w:val="000000" w:themeColor="text1"/>
+          <w:sz w:val="24"/>
+          <w:szCs w:val="24"/>
+        </w:rPr>
+        <w:t xml:space="preserve">Em substituição a ferramentas genéricas como Node-RED ou plataformas em nuvem proprietárias (Ubidots), desenvolveu-se um servidor web em Node.js (Express, Socket.IO e MQTT.js) que estabelece um túnel de baixa latência entre o broker MQTT e navegadores clientes (FETTE; MELNIKOV, 2011). O backend integra controle de taxa (rate limiting de 500 ms por cliente contra requisições abusivas), endpoint RESTful de telemetria e diagnóstico operacional (/api/status) e desligamento gracioso (graceful shutdown).</w:t>
+      </w:r>
+    </w:p>
+    <w:p>
+      <w:pPr>
+        <w:spacing w:line="360" w:lineRule="auto"/>
+        <w:jc w:val="both"/>
+        <w:rPr>
+          <w:rFonts w:ascii="Arial" w:hAnsi="Arial" w:cs="Arial"/>
+          <w:color w:val="000000" w:themeColor="text1"/>
+          <w:sz w:val="24"/>
+          <w:szCs w:val="24"/>
+        </w:rPr>
+      </w:pPr>
+      <w:r>
+        <w:rPr>
+          <w:rFonts w:ascii="Arial" w:hAnsi="Arial" w:cs="Arial"/>
+          <w:b/>
+          <w:color w:val="000000" w:themeColor="text1"/>
+          <w:sz w:val="24"/>
+          <w:szCs w:val="24"/>
+        </w:rPr>
+        <w:t xml:space="preserve">j) Estratégia dual de broker MQTT e metodologia Local-First: </w:t>
+      </w:r>
+      <w:r>
+        <w:rPr>
+          <w:rFonts w:ascii="Arial" w:hAnsi="Arial" w:cs="Arial"/>
+          <w:color w:val="000000" w:themeColor="text1"/>
+          <w:sz w:val="24"/>
+          <w:szCs w:val="24"/>
+        </w:rPr>
+        <w:t xml:space="preserve">O ecossistema oferece suporte dual: broker local Eclipse Mosquitto (LIGHT, 2017) na porta 1883 (com escuta listener 1883 0.0.0.0 e liberação correspondente no firewall) para desenvolvimento e testes de bancada em rede local; e broker em nuvem HiveMQ Cloud na porta 8883 com TLS e credenciais criptografadas para produção. A estratégia Local-First permitiu estabilizar integralmente a lógica determinística da FSM e a integridade de mensagens antes de submeter o sistema a variáveis de latência e instabilidade de redes externas.</w:t>
+      </w:r>
+    </w:p>
+    <w:p>
+      <w:pPr>
+        <w:spacing w:line="360" w:lineRule="auto"/>
+        <w:jc w:val="both"/>
+        <w:rPr>
+          <w:rFonts w:ascii="Arial" w:hAnsi="Arial" w:cs="Arial"/>
+          <w:color w:val="000000" w:themeColor="text1"/>
+          <w:sz w:val="24"/>
+          <w:szCs w:val="24"/>
+        </w:rPr>
+      </w:pPr>
+      <w:r>
+        <w:rPr>
+          <w:rFonts w:ascii="Arial" w:hAnsi="Arial" w:cs="Arial"/>
+          <w:b/>
+          <w:color w:val="000000" w:themeColor="text1"/>
+          <w:sz w:val="24"/>
+          <w:szCs w:val="24"/>
+        </w:rPr>
+        <w:t xml:space="preserve">k) Remoção dos botões físicos e controle exclusivo via dashboard: </w:t>
+      </w:r>
+      <w:r>
+        <w:rPr>
+          <w:rFonts w:ascii="Arial" w:hAnsi="Arial" w:cs="Arial"/>
+          <w:color w:val="000000" w:themeColor="text1"/>
+          <w:sz w:val="24"/>
+          <w:szCs w:val="24"/>
+        </w:rPr>
+        <w:t xml:space="preserve">Os quatro botões físicos previstos no microcontrolador foram desabilitados, e a solicitação de peças passou a ser efetuada exclusivamente por meio da interface gráfica web. A alteração elimina cabeamento redundante na bancada e comprova experimentalmente o propósito do projeto: a gestão remota de pedidos de intralogística via arquitetura IoT.</w:t>
+      </w:r>
+    </w:p>
+    <w:p>
+      <w:pPr>
+        <w:spacing w:line="360" w:lineRule="auto"/>
+        <w:jc w:val="both"/>
+        <w:rPr>
+          <w:rFonts w:ascii="Arial" w:hAnsi="Arial" w:cs="Arial"/>
+          <w:color w:val="000000" w:themeColor="text1"/>
+          <w:sz w:val="24"/>
+          <w:szCs w:val="24"/>
+        </w:rPr>
+      </w:pPr>
+      <w:r>
+        <w:rPr>
+          <w:rFonts w:ascii="Arial" w:hAnsi="Arial" w:cs="Arial"/>
+          <w:b/>
+          <w:color w:val="000000" w:themeColor="text1"/>
+          <w:sz w:val="24"/>
+          <w:szCs w:val="24"/>
+        </w:rPr>
+        <w:t xml:space="preserve">l) Simulador offline desacoplado: </w:t>
+      </w:r>
+      <w:r>
+        <w:rPr>
+          <w:rFonts w:ascii="Arial" w:hAnsi="Arial" w:cs="Arial"/>
+          <w:color w:val="000000" w:themeColor="text1"/>
+          <w:sz w:val="24"/>
+          <w:szCs w:val="24"/>
+        </w:rPr>
+        <w:t xml:space="preserve">Foi desenvolvido um simulador em JavaScript que replica de maneira fidedigna a máquina de estados do microcontrolador e a dinâmica temporal dos sensores e atuadores, alimentando o dashboard sem exigir hardware físico ou broker ativo. A ferramenta permitiu o avanço paralelo no desenvolvimento do front-end e dos fluxos lógicos de negócio.</w:t>
+      </w:r>
+    </w:p>
+    <w:p>
+      <w:pPr>
+        <w:spacing w:line="360" w:lineRule="auto"/>
+        <w:jc w:val="both"/>
+        <w:rPr>
+          <w:rFonts w:ascii="Arial" w:hAnsi="Arial" w:cs="Arial"/>
+          <w:color w:val="000000" w:themeColor="text1"/>
+          <w:sz w:val="24"/>
+          <w:szCs w:val="24"/>
+        </w:rPr>
+      </w:pPr>
+      <w:r>
+        <w:rPr>
+          <w:rFonts w:ascii="Arial" w:hAnsi="Arial" w:cs="Arial"/>
+          <w:b/>
+          <w:color w:val="000000" w:themeColor="text1"/>
+          <w:sz w:val="24"/>
+          <w:szCs w:val="24"/>
+        </w:rPr>
+        <w:t xml:space="preserve">m) Metodologia de testes incrementais e instrumentação experimental: </w:t>
+      </w:r>
+      <w:r>
+        <w:rPr>
+          <w:rFonts w:ascii="Arial" w:hAnsi="Arial" w:cs="Arial"/>
+          <w:color w:val="000000" w:themeColor="text1"/>
+          <w:sz w:val="24"/>
+          <w:szCs w:val="24"/>
+        </w:rPr>
+        <w:t xml:space="preserve">O roteiro experimental foi estruturado em suítes progressivas: blocos de componentes isolados (B0.1 a B0.3), blocos de bancada integrada (B1 a B3) e cadeia de integração de ponta a ponta (Testes 1 a 6). Criou-se a sonda de telemetria mqtt_probe em Node.js para registro de mensagens com timestamp em dataflow/#, constituindo a base comprobatória de tempo de resposta e confiabilidade dos testes de bancada.</w:t>
+      </w:r>
+    </w:p>
+    <w:p>
+      <w:pPr>
+        <w:spacing w:line="360" w:lineRule="auto"/>
+        <w:jc w:val="both"/>
+        <w:rPr>
+          <w:rFonts w:ascii="Arial" w:hAnsi="Arial" w:cs="Arial"/>
+          <w:color w:val="000000" w:themeColor="text1"/>
+          <w:sz w:val="24"/>
+          <w:szCs w:val="24"/>
+        </w:rPr>
+      </w:pPr>
+      <w:r>
+        <w:rPr>
+          <w:rFonts w:ascii="Arial" w:hAnsi="Arial" w:cs="Arial"/>
+          <w:b/>
+          <w:color w:val="000000" w:themeColor="text1"/>
+          <w:sz w:val="24"/>
+          <w:szCs w:val="24"/>
+        </w:rPr>
+        <w:t xml:space="preserve">n) Trabalhos correlatos não acadêmicos: </w:t>
+      </w:r>
+      <w:r>
+        <w:rPr>
+          <w:rFonts w:ascii="Arial" w:hAnsi="Arial" w:cs="Arial"/>
+          <w:color w:val="000000" w:themeColor="text1"/>
+          <w:sz w:val="24"/>
+          <w:szCs w:val="24"/>
+        </w:rPr>
+        <w:t xml:space="preserve">O levantamento de projetos correlatos em repositórios abertos revelou implementações restritas a acionamentos simples de esteiras com sensores. A combinação sinérgica de FSM determinística com recuperação por reset, gateway MQTT com LWT retido, servidor WebSocket dedicado e simulador offline desacoplado estabelece a inovação e o rigor de engenharia deste projeto frente às soluções informais existentes.</w:t>
+      </w:r>
+    </w:p>
+    <w:p>
+      <w:pPr>
+        <w:spacing w:line="360" w:lineRule="auto"/>
+        <w:jc w:val="both"/>
+        <w:rPr>
+          <w:rFonts w:ascii="Arial" w:hAnsi="Arial" w:cs="Arial"/>
+          <w:color w:val="000000" w:themeColor="text1"/>
+          <w:sz w:val="24"/>
+          <w:szCs w:val="24"/>
+        </w:rPr>
+      </w:pPr>
+      <w:r>
+        <w:rPr>
+          <w:rFonts w:ascii="Arial" w:hAnsi="Arial" w:cs="Arial"/>
+          <w:b/>
+          <w:color w:val="000000" w:themeColor="text1"/>
+          <w:sz w:val="24"/>
+          <w:szCs w:val="24"/>
+        </w:rPr>
+        <w:t xml:space="preserve">Tabela 1 – Síntese das Decisões de Engenharia e Atualizações de Implementação. </w:t>
+      </w:r>
+      <w:r>
+        <w:rPr>
+          <w:rFonts w:ascii="Arial" w:hAnsi="Arial" w:cs="Arial"/>
+          <w:color w:val="000000" w:themeColor="text1"/>
+          <w:sz w:val="24"/>
+          <w:szCs w:val="24"/>
+        </w:rPr>
+        <w:t xml:space="preserve">A Tabela 1 sintetiza as treze decisões de engenharia adotadas ao longo do ciclo de desenvolvimento, classificadas por ordem de relevância e camada de impacto arquitetural (física e infraestrutura, mensageria e telemetria, firmware e controle em tempo real, metodologia e observabilidade), confrontando a concepção inicial com a solução definitiva implementada.</w:t>
+      </w:r>
+    </w:p>
+    <w:tbl>
+      <w:tblPr>
+        <w:tblW w:w="0" w:type="auto"/>
+        <w:tblBorders>
+          <w:top w:val="single" w:sz="6" w:space="0" w:color="888888"/>
+          <w:left w:val="none"/>
+          <w:bottom w:val="single" w:sz="6" w:space="0" w:color="888888"/>
+          <w:right w:val="none"/>
+          <w:insideH w:val="single" w:sz="4" w:space="0" w:color="D0D3D4"/>
+          <w:insideV w:val="none"/>
+        </w:tblBorders>
+        <w:tblCellMar>
+          <w:top w:w="120" w:type="dxa"/>
+          <w:left w:w="140" w:type="dxa"/>
+          <w:bottom w:w="120" w:type="dxa"/>
+          <w:right w:w="140" w:type="dxa"/>
+        </w:tblCellMar>
+        <w:jc w:val="center"/>
+      </w:tblPr>
+      <w:tblGrid>
+        <w:gridCol w:w="1800"/>
+        <w:gridCol w:w="1800"/>
+        <w:gridCol w:w="1800"/>
+        <w:gridCol w:w="2400"/>
+        <w:gridCol w:w="2200"/>
+      </w:tblGrid>
+      <w:tr>
+        <w:trPr>
+          <w:tblHeader/>
+          <w:cantSplit/>
+        </w:trPr>
+        <w:tc>
+          <w:tcPr>
+            <w:shd w:val="clear" w:color="auto" w:fill="EAECEE"/>
+            <w:vAlign w:val="center"/>
+          </w:tcPr>
+          <w:p>
+            <w:pPr>
+              <w:spacing w:line="240" w:lineRule="auto" w:before="80" w:after="80"/>
+              <w:jc w:val="center"/>
+              <w:rPr>
+                <w:rFonts w:ascii="Arial" w:hAnsi="Arial" w:cs="Arial"/>
+                <w:b/>
+                <w:sz w:val="18"/>
+                <w:szCs w:val="18"/>
+              </w:rPr>
+            </w:pPr>
+            <w:r>
+              <w:rPr>
+                <w:rFonts w:ascii="Arial" w:hAnsi="Arial" w:cs="Arial"/>
+                <w:b/>
+                <w:sz w:val="18"/>
+                <w:szCs w:val="18"/>
+              </w:rPr>
+              <w:t xml:space="preserve">Camada / Pilar</w:t>
+            </w:r>
+          </w:p>
+        </w:tc>
+        <w:tc>
+          <w:tcPr>
+            <w:shd w:val="clear" w:color="auto" w:fill="EAECEE"/>
+            <w:vAlign w:val="center"/>
+          </w:tcPr>
+          <w:p>
+            <w:pPr>
+              <w:spacing w:line="240" w:lineRule="auto" w:before="80" w:after="80"/>
+              <w:jc w:val="center"/>
+              <w:rPr>
+                <w:rFonts w:ascii="Arial" w:hAnsi="Arial" w:cs="Arial"/>
+                <w:b/>
+                <w:sz w:val="18"/>
+                <w:szCs w:val="18"/>
+              </w:rPr>
+            </w:pPr>
+            <w:r>
+              <w:rPr>
+                <w:rFonts w:ascii="Arial" w:hAnsi="Arial" w:cs="Arial"/>
+                <w:b/>
+                <w:sz w:val="18"/>
+                <w:szCs w:val="18"/>
+              </w:rPr>
+              <w:t xml:space="preserve">Decisão / Componente</w:t>
+            </w:r>
+          </w:p>
+        </w:tc>
+        <w:tc>
+          <w:tcPr>
+            <w:shd w:val="clear" w:color="auto" w:fill="EAECEE"/>
+            <w:vAlign w:val="center"/>
+          </w:tcPr>
+          <w:p>
+            <w:pPr>
+              <w:spacing w:line="240" w:lineRule="auto" w:before="80" w:after="80"/>
+              <w:jc w:val="center"/>
+              <w:rPr>
+                <w:rFonts w:ascii="Arial" w:hAnsi="Arial" w:cs="Arial"/>
+                <w:b/>
+                <w:sz w:val="18"/>
+                <w:szCs w:val="18"/>
+              </w:rPr>
+            </w:pPr>
+            <w:r>
+              <w:rPr>
+                <w:rFonts w:ascii="Arial" w:hAnsi="Arial" w:cs="Arial"/>
+                <w:b/>
+                <w:sz w:val="18"/>
+                <w:szCs w:val="18"/>
+              </w:rPr>
+              <w:t xml:space="preserve">Concepção Inicial</w:t>
+            </w:r>
+          </w:p>
+        </w:tc>
+        <w:tc>
+          <w:tcPr>
+            <w:shd w:val="clear" w:color="auto" w:fill="EAECEE"/>
+            <w:vAlign w:val="center"/>
+          </w:tcPr>
+          <w:p>
+            <w:pPr>
+              <w:spacing w:line="240" w:lineRule="auto" w:before="80" w:after="80"/>
+              <w:jc w:val="center"/>
+              <w:rPr>
+                <w:rFonts w:ascii="Arial" w:hAnsi="Arial" w:cs="Arial"/>
+                <w:b/>
+                <w:sz w:val="18"/>
+                <w:szCs w:val="18"/>
+              </w:rPr>
+            </w:pPr>
+            <w:r>
+              <w:rPr>
+                <w:rFonts w:ascii="Arial" w:hAnsi="Arial" w:cs="Arial"/>
+                <w:b/>
+                <w:sz w:val="18"/>
+                <w:szCs w:val="18"/>
+              </w:rPr>
+              <w:t xml:space="preserve">Implementação Final</w:t>
+            </w:r>
+          </w:p>
+        </w:tc>
+        <w:tc>
+          <w:tcPr>
+            <w:shd w:val="clear" w:color="auto" w:fill="EAECEE"/>
+            <w:vAlign w:val="center"/>
+          </w:tcPr>
+          <w:p>
+            <w:pPr>
+              <w:spacing w:line="240" w:lineRule="auto" w:before="80" w:after="80"/>
+              <w:jc w:val="center"/>
+              <w:rPr>
+                <w:rFonts w:ascii="Arial" w:hAnsi="Arial" w:cs="Arial"/>
+                <w:b/>
+                <w:sz w:val="18"/>
+                <w:szCs w:val="18"/>
+              </w:rPr>
+            </w:pPr>
+            <w:r>
+              <w:rPr>
+                <w:rFonts w:ascii="Arial" w:hAnsi="Arial" w:cs="Arial"/>
+                <w:b/>
+                <w:sz w:val="18"/>
+                <w:szCs w:val="18"/>
+              </w:rPr>
+              <w:t xml:space="preserve">Justificativa Técnica e Impacto</w:t>
+            </w:r>
+          </w:p>
+        </w:tc>
+      </w:tr>
+      <w:tr>
+        <w:trPr>
+          <w:cantSplit/>
+        </w:trPr>
+        <w:tc>
+          <w:tcPr>
+            <w:vAlign w:val="center"/>
+          </w:tcPr>
+          <w:p>
+            <w:pPr>
+              <w:spacing w:line="240" w:lineRule="auto" w:before="60" w:after="60"/>
+              <w:jc w:val="left"/>
+              <w:rPr>
+                <w:rFonts w:ascii="Arial" w:hAnsi="Arial" w:cs="Arial"/>
+                <w:b/>
+                <w:sz w:val="18"/>
+                <w:szCs w:val="18"/>
+              </w:rPr>
+            </w:pPr>
+            <w:r>
+              <w:rPr>
+                <w:rFonts w:ascii="Arial" w:hAnsi="Arial" w:cs="Arial"/>
+                <w:b/>
+                <w:sz w:val="18"/>
+                <w:szCs w:val="18"/>
+              </w:rPr>
+              <w:t xml:space="preserve">1. Camada Física e Infraestrutura</w:t>
+            </w:r>
+          </w:p>
+        </w:tc>
+        <w:tc>
+          <w:tcPr>
+            <w:vAlign w:val="center"/>
+          </w:tcPr>
+          <w:p>
+            <w:pPr>
+              <w:spacing w:line="240" w:lineRule="auto" w:before="60" w:after="60"/>
+              <w:jc w:val="left"/>
+              <w:rPr>
+                <w:rFonts w:ascii="Arial" w:hAnsi="Arial" w:cs="Arial"/>
+                <w:b/>
+                <w:sz w:val="18"/>
+                <w:szCs w:val="18"/>
+              </w:rPr>
+            </w:pPr>
+            <w:r>
+              <w:rPr>
+                <w:rFonts w:ascii="Arial" w:hAnsi="Arial" w:cs="Arial"/>
+                <w:b/>
+                <w:sz w:val="18"/>
+                <w:szCs w:val="18"/>
+              </w:rPr>
+              <w:t xml:space="preserve">Acionamento de Motores e Microcontrolador</w:t>
+            </w:r>
+          </w:p>
+        </w:tc>
+        <w:tc>
+          <w:tcPr>
+            <w:vAlign w:val="center"/>
+          </w:tcPr>
+          <w:p>
+            <w:pPr>
+              <w:spacing w:line="240" w:lineRule="auto" w:before="60" w:after="60"/>
+              <w:jc w:val="both"/>
+              <w:rPr>
+                <w:rFonts w:ascii="Arial" w:hAnsi="Arial" w:cs="Arial"/>
+                <w:sz w:val="18"/>
+                <w:szCs w:val="18"/>
+              </w:rPr>
+            </w:pPr>
+            <w:r>
+              <w:rPr>
+                <w:rFonts w:ascii="Arial" w:hAnsi="Arial" w:cs="Arial"/>
+                <w:sz w:val="18"/>
+                <w:szCs w:val="18"/>
+              </w:rPr>
+              <w:t xml:space="preserve">Driver L298N (12 pinos, queda ~2 V) + Arduino Mega</w:t>
+            </w:r>
+          </w:p>
+        </w:tc>
+        <w:tc>
+          <w:tcPr>
+            <w:vAlign w:val="center"/>
+          </w:tcPr>
+          <w:p>
+            <w:pPr>
+              <w:spacing w:line="240" w:lineRule="auto" w:before="60" w:after="60"/>
+              <w:jc w:val="both"/>
+              <w:rPr>
+                <w:rFonts w:ascii="Arial" w:hAnsi="Arial" w:cs="Arial"/>
+                <w:sz w:val="18"/>
+                <w:szCs w:val="18"/>
+              </w:rPr>
+            </w:pPr>
+            <w:r>
+              <w:rPr>
+                <w:rFonts w:ascii="Arial" w:hAnsi="Arial" w:cs="Arial"/>
+                <w:sz w:val="18"/>
+                <w:szCs w:val="18"/>
+              </w:rPr>
+              <w:t xml:space="preserve">4x MOSFET IRF520 (1 PWM/motor) + Arduino Uno + Esteira principal ligada direto na fonte</w:t>
+            </w:r>
+          </w:p>
+        </w:tc>
+        <w:tc>
+          <w:tcPr>
+            <w:vAlign w:val="center"/>
+          </w:tcPr>
+          <w:p>
+            <w:pPr>
+              <w:spacing w:line="240" w:lineRule="auto" w:before="60" w:after="60"/>
+              <w:jc w:val="both"/>
+              <w:rPr>
+                <w:rFonts w:ascii="Arial" w:hAnsi="Arial" w:cs="Arial"/>
+                <w:sz w:val="18"/>
+                <w:szCs w:val="18"/>
+              </w:rPr>
+            </w:pPr>
+            <w:r>
+              <w:rPr>
+                <w:rFonts w:ascii="Arial" w:hAnsi="Arial" w:cs="Arial"/>
+                <w:sz w:val="18"/>
+                <w:szCs w:val="18"/>
+              </w:rPr>
+              <w:t xml:space="preserve">Redução drástica de pinos de E/S, eliminação de queda de tensão crítica (2 V em motores 5 V), menor custo.</w:t>
+            </w:r>
+          </w:p>
+        </w:tc>
+      </w:tr>
+      <w:tr>
+        <w:trPr>
+          <w:cantSplit/>
+        </w:trPr>
+        <w:tc>
+          <w:tcPr>
+            <w:vAlign w:val="center"/>
+          </w:tcPr>
+          <w:p>
+            <w:pPr>
+              <w:spacing w:line="240" w:lineRule="auto" w:before="60" w:after="60"/>
+              <w:jc w:val="left"/>
+              <w:rPr>
+                <w:rFonts w:ascii="Arial" w:hAnsi="Arial" w:cs="Arial"/>
+                <w:b/>
+                <w:sz w:val="18"/>
+                <w:szCs w:val="18"/>
+              </w:rPr>
+            </w:pPr>
+            <w:r>
+              <w:rPr>
+                <w:rFonts w:ascii="Arial" w:hAnsi="Arial" w:cs="Arial"/>
+                <w:b/>
+                <w:sz w:val="18"/>
+                <w:szCs w:val="18"/>
+              </w:rPr>
+              <w:t xml:space="preserve">1. Camada Física e Infraestrutura</w:t>
+            </w:r>
+          </w:p>
+        </w:tc>
+        <w:tc>
+          <w:tcPr>
+            <w:vAlign w:val="center"/>
+          </w:tcPr>
+          <w:p>
+            <w:pPr>
+              <w:spacing w:line="240" w:lineRule="auto" w:before="60" w:after="60"/>
+              <w:jc w:val="left"/>
+              <w:rPr>
+                <w:rFonts w:ascii="Arial" w:hAnsi="Arial" w:cs="Arial"/>
+                <w:b/>
+                <w:sz w:val="18"/>
+                <w:szCs w:val="18"/>
+              </w:rPr>
+            </w:pPr>
+            <w:r>
+              <w:rPr>
+                <w:rFonts w:ascii="Arial" w:hAnsi="Arial" w:cs="Arial"/>
+                <w:b/>
+                <w:sz w:val="18"/>
+                <w:szCs w:val="18"/>
+              </w:rPr>
+              <w:t xml:space="preserve">Pinagem de Sensores e Barramento I2C</w:t>
+            </w:r>
+          </w:p>
+        </w:tc>
+        <w:tc>
+          <w:tcPr>
+            <w:vAlign w:val="center"/>
+          </w:tcPr>
+          <w:p>
+            <w:pPr>
+              <w:spacing w:line="240" w:lineRule="auto" w:before="60" w:after="60"/>
+              <w:jc w:val="both"/>
+              <w:rPr>
+                <w:rFonts w:ascii="Arial" w:hAnsi="Arial" w:cs="Arial"/>
+                <w:sz w:val="18"/>
+                <w:szCs w:val="18"/>
+              </w:rPr>
+            </w:pPr>
+            <w:r>
+              <w:rPr>
+                <w:rFonts w:ascii="Arial" w:hAnsi="Arial" w:cs="Arial"/>
+                <w:sz w:val="18"/>
+                <w:szCs w:val="18"/>
+              </w:rPr>
+              <w:t xml:space="preserve">Sensores J2/J3 em pinos analógicos compartilhados (A4/A5)</w:t>
+            </w:r>
+          </w:p>
+        </w:tc>
+        <w:tc>
+          <w:tcPr>
+            <w:vAlign w:val="center"/>
+          </w:tcPr>
+          <w:p>
+            <w:pPr>
+              <w:spacing w:line="240" w:lineRule="auto" w:before="60" w:after="60"/>
+              <w:jc w:val="both"/>
+              <w:rPr>
+                <w:rFonts w:ascii="Arial" w:hAnsi="Arial" w:cs="Arial"/>
+                <w:sz w:val="18"/>
+                <w:szCs w:val="18"/>
+              </w:rPr>
+            </w:pPr>
+            <w:r>
+              <w:rPr>
+                <w:rFonts w:ascii="Arial" w:hAnsi="Arial" w:cs="Arial"/>
+                <w:sz w:val="18"/>
+                <w:szCs w:val="18"/>
+              </w:rPr>
+              <w:t xml:space="preserve">J2 em D2, J3 em D4; portas A4 (SDA) e A5 (SCL) dedicadas ao LCD I2C</w:t>
+            </w:r>
+          </w:p>
+        </w:tc>
+        <w:tc>
+          <w:tcPr>
+            <w:vAlign w:val="center"/>
+          </w:tcPr>
+          <w:p>
+            <w:pPr>
+              <w:spacing w:line="240" w:lineRule="auto" w:before="60" w:after="60"/>
+              <w:jc w:val="both"/>
+              <w:rPr>
+                <w:rFonts w:ascii="Arial" w:hAnsi="Arial" w:cs="Arial"/>
+                <w:sz w:val="18"/>
+                <w:szCs w:val="18"/>
+              </w:rPr>
+            </w:pPr>
+            <w:r>
+              <w:rPr>
+                <w:rFonts w:ascii="Arial" w:hAnsi="Arial" w:cs="Arial"/>
+                <w:sz w:val="18"/>
+                <w:szCs w:val="18"/>
+              </w:rPr>
+              <w:t xml:space="preserve">Eliminação definitiva de colisões de hardware e travamentos no barramento I2C do display LCD 16x2.</w:t>
+            </w:r>
+          </w:p>
+        </w:tc>
+      </w:tr>
+      <w:tr>
+        <w:trPr>
+          <w:cantSplit/>
+        </w:trPr>
+        <w:tc>
+          <w:tcPr>
+            <w:vAlign w:val="center"/>
+          </w:tcPr>
+          <w:p>
+            <w:pPr>
+              <w:spacing w:line="240" w:lineRule="auto" w:before="60" w:after="60"/>
+              <w:jc w:val="left"/>
+              <w:rPr>
+                <w:rFonts w:ascii="Arial" w:hAnsi="Arial" w:cs="Arial"/>
+                <w:b/>
+                <w:sz w:val="18"/>
+                <w:szCs w:val="18"/>
+              </w:rPr>
+            </w:pPr>
+            <w:r>
+              <w:rPr>
+                <w:rFonts w:ascii="Arial" w:hAnsi="Arial" w:cs="Arial"/>
+                <w:b/>
+                <w:sz w:val="18"/>
+                <w:szCs w:val="18"/>
+              </w:rPr>
+              <w:t xml:space="preserve">1. Camada Física e Infraestrutura</w:t>
+            </w:r>
+          </w:p>
+        </w:tc>
+        <w:tc>
+          <w:tcPr>
+            <w:vAlign w:val="center"/>
+          </w:tcPr>
+          <w:p>
+            <w:pPr>
+              <w:spacing w:line="240" w:lineRule="auto" w:before="60" w:after="60"/>
+              <w:jc w:val="left"/>
+              <w:rPr>
+                <w:rFonts w:ascii="Arial" w:hAnsi="Arial" w:cs="Arial"/>
+                <w:b/>
+                <w:sz w:val="18"/>
+                <w:szCs w:val="18"/>
+              </w:rPr>
+            </w:pPr>
+            <w:r>
+              <w:rPr>
+                <w:rFonts w:ascii="Arial" w:hAnsi="Arial" w:cs="Arial"/>
+                <w:b/>
+                <w:sz w:val="18"/>
+                <w:szCs w:val="18"/>
+              </w:rPr>
+              <w:t xml:space="preserve">Condicionamento de Sinal UART</w:t>
+            </w:r>
+          </w:p>
+        </w:tc>
+        <w:tc>
+          <w:tcPr>
+            <w:vAlign w:val="center"/>
+          </w:tcPr>
+          <w:p>
+            <w:pPr>
+              <w:spacing w:line="240" w:lineRule="auto" w:before="60" w:after="60"/>
+              <w:jc w:val="both"/>
+              <w:rPr>
+                <w:rFonts w:ascii="Arial" w:hAnsi="Arial" w:cs="Arial"/>
+                <w:sz w:val="18"/>
+                <w:szCs w:val="18"/>
+              </w:rPr>
+            </w:pPr>
+            <w:r>
+              <w:rPr>
+                <w:rFonts w:ascii="Arial" w:hAnsi="Arial" w:cs="Arial"/>
+                <w:sz w:val="18"/>
+                <w:szCs w:val="18"/>
+              </w:rPr>
+              <w:t xml:space="preserve">Conexão direta 5 V (Uno) para 3,3 V (ESP32) sem divisor e terra indefinido</w:t>
+            </w:r>
+          </w:p>
+        </w:tc>
+        <w:tc>
+          <w:tcPr>
+            <w:vAlign w:val="center"/>
+          </w:tcPr>
+          <w:p>
+            <w:pPr>
+              <w:spacing w:line="240" w:lineRule="auto" w:before="60" w:after="60"/>
+              <w:jc w:val="both"/>
+              <w:rPr>
+                <w:rFonts w:ascii="Arial" w:hAnsi="Arial" w:cs="Arial"/>
+                <w:sz w:val="18"/>
+                <w:szCs w:val="18"/>
+              </w:rPr>
+            </w:pPr>
+            <w:r>
+              <w:rPr>
+                <w:rFonts w:ascii="Arial" w:hAnsi="Arial" w:cs="Arial"/>
+                <w:sz w:val="18"/>
+                <w:szCs w:val="18"/>
+              </w:rPr>
+              <w:t xml:space="preserve">Divisor de tensão resistivo (1 kΩ / 2 kΩ) na linha RX do ESP32 + GND comum obrigatório</w:t>
+            </w:r>
+          </w:p>
+        </w:tc>
+        <w:tc>
+          <w:tcPr>
+            <w:vAlign w:val="center"/>
+          </w:tcPr>
+          <w:p>
+            <w:pPr>
+              <w:spacing w:line="240" w:lineRule="auto" w:before="60" w:after="60"/>
+              <w:jc w:val="both"/>
+              <w:rPr>
+                <w:rFonts w:ascii="Arial" w:hAnsi="Arial" w:cs="Arial"/>
+                <w:sz w:val="18"/>
+                <w:szCs w:val="18"/>
+              </w:rPr>
+            </w:pPr>
+            <w:r>
+              <w:rPr>
+                <w:rFonts w:ascii="Arial" w:hAnsi="Arial" w:cs="Arial"/>
+                <w:sz w:val="18"/>
+                <w:szCs w:val="18"/>
+              </w:rPr>
+              <w:t xml:space="preserve">Proteção elétrica das portas do ESP32 contra sobretensão e eliminação de corrupção de caracteres na UART.</w:t>
+            </w:r>
+          </w:p>
+        </w:tc>
+      </w:tr>
+      <w:tr>
+        <w:trPr>
+          <w:cantSplit/>
+        </w:trPr>
+        <w:tc>
+          <w:tcPr>
+            <w:vAlign w:val="center"/>
+          </w:tcPr>
+          <w:p>
+            <w:pPr>
+              <w:spacing w:line="240" w:lineRule="auto" w:before="60" w:after="60"/>
+              <w:jc w:val="left"/>
+              <w:rPr>
+                <w:rFonts w:ascii="Arial" w:hAnsi="Arial" w:cs="Arial"/>
+                <w:b/>
+                <w:sz w:val="18"/>
+                <w:szCs w:val="18"/>
+              </w:rPr>
+            </w:pPr>
+            <w:r>
+              <w:rPr>
+                <w:rFonts w:ascii="Arial" w:hAnsi="Arial" w:cs="Arial"/>
+                <w:b/>
+                <w:sz w:val="18"/>
+                <w:szCs w:val="18"/>
+              </w:rPr>
+              <w:t xml:space="preserve">1. Camada Física e Infraestrutura</w:t>
+            </w:r>
+          </w:p>
+        </w:tc>
+        <w:tc>
+          <w:tcPr>
+            <w:vAlign w:val="center"/>
+          </w:tcPr>
+          <w:p>
+            <w:pPr>
+              <w:spacing w:line="240" w:lineRule="auto" w:before="60" w:after="60"/>
+              <w:jc w:val="left"/>
+              <w:rPr>
+                <w:rFonts w:ascii="Arial" w:hAnsi="Arial" w:cs="Arial"/>
+                <w:b/>
+                <w:sz w:val="18"/>
+                <w:szCs w:val="18"/>
+              </w:rPr>
+            </w:pPr>
+            <w:r>
+              <w:rPr>
+                <w:rFonts w:ascii="Arial" w:hAnsi="Arial" w:cs="Arial"/>
+                <w:b/>
+                <w:sz w:val="18"/>
+                <w:szCs w:val="18"/>
+              </w:rPr>
+              <w:t xml:space="preserve">Configuração do Broker de Rede</w:t>
+            </w:r>
+          </w:p>
+        </w:tc>
+        <w:tc>
+          <w:tcPr>
+            <w:vAlign w:val="center"/>
+          </w:tcPr>
+          <w:p>
+            <w:pPr>
+              <w:spacing w:line="240" w:lineRule="auto" w:before="60" w:after="60"/>
+              <w:jc w:val="both"/>
+              <w:rPr>
+                <w:rFonts w:ascii="Arial" w:hAnsi="Arial" w:cs="Arial"/>
+                <w:sz w:val="18"/>
+                <w:szCs w:val="18"/>
+              </w:rPr>
+            </w:pPr>
+            <w:r>
+              <w:rPr>
+                <w:rFonts w:ascii="Arial" w:hAnsi="Arial" w:cs="Arial"/>
+                <w:sz w:val="18"/>
+                <w:szCs w:val="18"/>
+              </w:rPr>
+              <w:t xml:space="preserve">Mosquitto default (apenas loopback 127.0.0.1) e firewall fechado</w:t>
+            </w:r>
+          </w:p>
+        </w:tc>
+        <w:tc>
+          <w:tcPr>
+            <w:vAlign w:val="center"/>
+          </w:tcPr>
+          <w:p>
+            <w:pPr>
+              <w:spacing w:line="240" w:lineRule="auto" w:before="60" w:after="60"/>
+              <w:jc w:val="both"/>
+              <w:rPr>
+                <w:rFonts w:ascii="Arial" w:hAnsi="Arial" w:cs="Arial"/>
+                <w:sz w:val="18"/>
+                <w:szCs w:val="18"/>
+              </w:rPr>
+            </w:pPr>
+            <w:r>
+              <w:rPr>
+                <w:rFonts w:ascii="Arial" w:hAnsi="Arial" w:cs="Arial"/>
+                <w:sz w:val="18"/>
+                <w:szCs w:val="18"/>
+              </w:rPr>
+              <w:t xml:space="preserve">listener 1883 0.0.0.0 explícito, serviço em modo sob demanda e porta 1883 liberada no Firewall</w:t>
+            </w:r>
+          </w:p>
+        </w:tc>
+        <w:tc>
+          <w:tcPr>
+            <w:vAlign w:val="center"/>
+          </w:tcPr>
+          <w:p>
+            <w:pPr>
+              <w:spacing w:line="240" w:lineRule="auto" w:before="60" w:after="60"/>
+              <w:jc w:val="both"/>
+              <w:rPr>
+                <w:rFonts w:ascii="Arial" w:hAnsi="Arial" w:cs="Arial"/>
+                <w:sz w:val="18"/>
+                <w:szCs w:val="18"/>
+              </w:rPr>
+            </w:pPr>
+            <w:r>
+              <w:rPr>
+                <w:rFonts w:ascii="Arial" w:hAnsi="Arial" w:cs="Arial"/>
+                <w:sz w:val="18"/>
+                <w:szCs w:val="18"/>
+              </w:rPr>
+              <w:t xml:space="preserve">Garantia de roteamento TCP entre microcontroladores na WLAN e o broker no host.</w:t>
+            </w:r>
+          </w:p>
+        </w:tc>
+      </w:tr>
+      <w:tr>
+        <w:trPr>
+          <w:cantSplit/>
+        </w:trPr>
+        <w:tc>
+          <w:tcPr>
+            <w:vAlign w:val="center"/>
+          </w:tcPr>
+          <w:p>
+            <w:pPr>
+              <w:spacing w:line="240" w:lineRule="auto" w:before="60" w:after="60"/>
+              <w:jc w:val="left"/>
+              <w:rPr>
+                <w:rFonts w:ascii="Arial" w:hAnsi="Arial" w:cs="Arial"/>
+                <w:b/>
+                <w:sz w:val="18"/>
+                <w:szCs w:val="18"/>
+              </w:rPr>
+            </w:pPr>
+            <w:r>
+              <w:rPr>
+                <w:rFonts w:ascii="Arial" w:hAnsi="Arial" w:cs="Arial"/>
+                <w:b/>
+                <w:sz w:val="18"/>
+                <w:szCs w:val="18"/>
+              </w:rPr>
+              <w:t xml:space="preserve">2. Protocolo de Mensageria e Telemetria</w:t>
+            </w:r>
+          </w:p>
+        </w:tc>
+        <w:tc>
+          <w:tcPr>
+            <w:vAlign w:val="center"/>
+          </w:tcPr>
+          <w:p>
+            <w:pPr>
+              <w:spacing w:line="240" w:lineRule="auto" w:before="60" w:after="60"/>
+              <w:jc w:val="left"/>
+              <w:rPr>
+                <w:rFonts w:ascii="Arial" w:hAnsi="Arial" w:cs="Arial"/>
+                <w:b/>
+                <w:sz w:val="18"/>
+                <w:szCs w:val="18"/>
+              </w:rPr>
+            </w:pPr>
+            <w:r>
+              <w:rPr>
+                <w:rFonts w:ascii="Arial" w:hAnsi="Arial" w:cs="Arial"/>
+                <w:b/>
+                <w:sz w:val="18"/>
+                <w:szCs w:val="18"/>
+              </w:rPr>
+              <w:t xml:space="preserve">Formato da Mensagem Serial</w:t>
+            </w:r>
+          </w:p>
+        </w:tc>
+        <w:tc>
+          <w:tcPr>
+            <w:vAlign w:val="center"/>
+          </w:tcPr>
+          <w:p>
+            <w:pPr>
+              <w:spacing w:line="240" w:lineRule="auto" w:before="60" w:after="60"/>
+              <w:jc w:val="both"/>
+              <w:rPr>
+                <w:rFonts w:ascii="Arial" w:hAnsi="Arial" w:cs="Arial"/>
+                <w:sz w:val="18"/>
+                <w:szCs w:val="18"/>
+              </w:rPr>
+            </w:pPr>
+            <w:r>
+              <w:rPr>
+                <w:rFonts w:ascii="Arial" w:hAnsi="Arial" w:cs="Arial"/>
+                <w:sz w:val="18"/>
+                <w:szCs w:val="18"/>
+              </w:rPr>
+              <w:t xml:space="preserve">Texto delimitado não padronizado (MQTT|tipo:A|...)</w:t>
+            </w:r>
+          </w:p>
+        </w:tc>
+        <w:tc>
+          <w:tcPr>
+            <w:vAlign w:val="center"/>
+          </w:tcPr>
+          <w:p>
+            <w:pPr>
+              <w:spacing w:line="240" w:lineRule="auto" w:before="60" w:after="60"/>
+              <w:jc w:val="both"/>
+              <w:rPr>
+                <w:rFonts w:ascii="Arial" w:hAnsi="Arial" w:cs="Arial"/>
+                <w:sz w:val="18"/>
+                <w:szCs w:val="18"/>
+              </w:rPr>
+            </w:pPr>
+            <w:r>
+              <w:rPr>
+                <w:rFonts w:ascii="Arial" w:hAnsi="Arial" w:cs="Arial"/>
+                <w:sz w:val="18"/>
+                <w:szCs w:val="18"/>
+              </w:rPr>
+              <w:t xml:space="preserve">JSON estruturado com discriminador "type" via ArduinoJson</w:t>
+            </w:r>
+          </w:p>
+        </w:tc>
+        <w:tc>
+          <w:tcPr>
+            <w:vAlign w:val="center"/>
+          </w:tcPr>
+          <w:p>
+            <w:pPr>
+              <w:spacing w:line="240" w:lineRule="auto" w:before="60" w:after="60"/>
+              <w:jc w:val="both"/>
+              <w:rPr>
+                <w:rFonts w:ascii="Arial" w:hAnsi="Arial" w:cs="Arial"/>
+                <w:sz w:val="18"/>
+                <w:szCs w:val="18"/>
+              </w:rPr>
+            </w:pPr>
+            <w:r>
+              <w:rPr>
+                <w:rFonts w:ascii="Arial" w:hAnsi="Arial" w:cs="Arial"/>
+                <w:sz w:val="18"/>
+                <w:szCs w:val="18"/>
+              </w:rPr>
+              <w:t xml:space="preserve">Parsing robusto e extensível com roteamento direto para a árvore de tópicos dataflow/#.</w:t>
+            </w:r>
+          </w:p>
+        </w:tc>
+      </w:tr>
+      <w:tr>
+        <w:trPr>
+          <w:cantSplit/>
+        </w:trPr>
+        <w:tc>
+          <w:tcPr>
+            <w:vAlign w:val="center"/>
+          </w:tcPr>
+          <w:p>
+            <w:pPr>
+              <w:spacing w:line="240" w:lineRule="auto" w:before="60" w:after="60"/>
+              <w:jc w:val="left"/>
+              <w:rPr>
+                <w:rFonts w:ascii="Arial" w:hAnsi="Arial" w:cs="Arial"/>
+                <w:b/>
+                <w:sz w:val="18"/>
+                <w:szCs w:val="18"/>
+              </w:rPr>
+            </w:pPr>
+            <w:r>
+              <w:rPr>
+                <w:rFonts w:ascii="Arial" w:hAnsi="Arial" w:cs="Arial"/>
+                <w:b/>
+                <w:sz w:val="18"/>
+                <w:szCs w:val="18"/>
+              </w:rPr>
+              <w:t xml:space="preserve">2. Protocolo de Mensageria e Telemetria</w:t>
+            </w:r>
+          </w:p>
+        </w:tc>
+        <w:tc>
+          <w:tcPr>
+            <w:vAlign w:val="center"/>
+          </w:tcPr>
+          <w:p>
+            <w:pPr>
+              <w:spacing w:line="240" w:lineRule="auto" w:before="60" w:after="60"/>
+              <w:jc w:val="left"/>
+              <w:rPr>
+                <w:rFonts w:ascii="Arial" w:hAnsi="Arial" w:cs="Arial"/>
+                <w:b/>
+                <w:sz w:val="18"/>
+                <w:szCs w:val="18"/>
+              </w:rPr>
+            </w:pPr>
+            <w:r>
+              <w:rPr>
+                <w:rFonts w:ascii="Arial" w:hAnsi="Arial" w:cs="Arial"/>
+                <w:b/>
+                <w:sz w:val="18"/>
+                <w:szCs w:val="18"/>
+              </w:rPr>
+              <w:t xml:space="preserve">Isolamento de Tópicos de Status</w:t>
+            </w:r>
+          </w:p>
+        </w:tc>
+        <w:tc>
+          <w:tcPr>
+            <w:vAlign w:val="center"/>
+          </w:tcPr>
+          <w:p>
+            <w:pPr>
+              <w:spacing w:line="240" w:lineRule="auto" w:before="60" w:after="60"/>
+              <w:jc w:val="both"/>
+              <w:rPr>
+                <w:rFonts w:ascii="Arial" w:hAnsi="Arial" w:cs="Arial"/>
+                <w:sz w:val="18"/>
+                <w:szCs w:val="18"/>
+              </w:rPr>
+            </w:pPr>
+            <w:r>
+              <w:rPr>
+                <w:rFonts w:ascii="Arial" w:hAnsi="Arial" w:cs="Arial"/>
+                <w:sz w:val="18"/>
+                <w:szCs w:val="18"/>
+              </w:rPr>
+              <w:t xml:space="preserve">ESP32 e servidor Node.js publicavam no mesmo tópico dataflow/status</w:t>
+            </w:r>
+          </w:p>
+        </w:tc>
+        <w:tc>
+          <w:tcPr>
+            <w:vAlign w:val="center"/>
+          </w:tcPr>
+          <w:p>
+            <w:pPr>
+              <w:spacing w:line="240" w:lineRule="auto" w:before="60" w:after="60"/>
+              <w:jc w:val="both"/>
+              <w:rPr>
+                <w:rFonts w:ascii="Arial" w:hAnsi="Arial" w:cs="Arial"/>
+                <w:sz w:val="18"/>
+                <w:szCs w:val="18"/>
+              </w:rPr>
+            </w:pPr>
+            <w:r>
+              <w:rPr>
+                <w:rFonts w:ascii="Arial" w:hAnsi="Arial" w:cs="Arial"/>
+                <w:sz w:val="18"/>
+                <w:szCs w:val="18"/>
+              </w:rPr>
+              <w:t xml:space="preserve">ESP32 em dataflow/status; Servidor em dataflow/status/server</w:t>
+            </w:r>
+          </w:p>
+        </w:tc>
+        <w:tc>
+          <w:tcPr>
+            <w:vAlign w:val="center"/>
+          </w:tcPr>
+          <w:p>
+            <w:pPr>
+              <w:spacing w:line="240" w:lineRule="auto" w:before="60" w:after="60"/>
+              <w:jc w:val="both"/>
+              <w:rPr>
+                <w:rFonts w:ascii="Arial" w:hAnsi="Arial" w:cs="Arial"/>
+                <w:sz w:val="18"/>
+                <w:szCs w:val="18"/>
+              </w:rPr>
+            </w:pPr>
+            <w:r>
+              <w:rPr>
+                <w:rFonts w:ascii="Arial" w:hAnsi="Arial" w:cs="Arial"/>
+                <w:sz w:val="18"/>
+                <w:szCs w:val="18"/>
+              </w:rPr>
+              <w:t xml:space="preserve">Elimina colisão de mensagens retidas (retained) e falsos alertas de gateway desconectado.</w:t>
+            </w:r>
+          </w:p>
+        </w:tc>
+      </w:tr>
+      <w:tr>
+        <w:trPr>
+          <w:cantSplit/>
+        </w:trPr>
+        <w:tc>
+          <w:tcPr>
+            <w:vAlign w:val="center"/>
+          </w:tcPr>
+          <w:p>
+            <w:pPr>
+              <w:spacing w:line="240" w:lineRule="auto" w:before="60" w:after="60"/>
+              <w:jc w:val="left"/>
+              <w:rPr>
+                <w:rFonts w:ascii="Arial" w:hAnsi="Arial" w:cs="Arial"/>
+                <w:b/>
+                <w:sz w:val="18"/>
+                <w:szCs w:val="18"/>
+              </w:rPr>
+            </w:pPr>
+            <w:r>
+              <w:rPr>
+                <w:rFonts w:ascii="Arial" w:hAnsi="Arial" w:cs="Arial"/>
+                <w:b/>
+                <w:sz w:val="18"/>
+                <w:szCs w:val="18"/>
+              </w:rPr>
+              <w:t xml:space="preserve">2. Protocolo de Mensageria e Telemetria</w:t>
+            </w:r>
+          </w:p>
+        </w:tc>
+        <w:tc>
+          <w:tcPr>
+            <w:vAlign w:val="center"/>
+          </w:tcPr>
+          <w:p>
+            <w:pPr>
+              <w:spacing w:line="240" w:lineRule="auto" w:before="60" w:after="60"/>
+              <w:jc w:val="left"/>
+              <w:rPr>
+                <w:rFonts w:ascii="Arial" w:hAnsi="Arial" w:cs="Arial"/>
+                <w:b/>
+                <w:sz w:val="18"/>
+                <w:szCs w:val="18"/>
+              </w:rPr>
+            </w:pPr>
+            <w:r>
+              <w:rPr>
+                <w:rFonts w:ascii="Arial" w:hAnsi="Arial" w:cs="Arial"/>
+                <w:b/>
+                <w:sz w:val="18"/>
+                <w:szCs w:val="18"/>
+              </w:rPr>
+              <w:t xml:space="preserve">Supervisão e Queda de Hardware (LWT)</w:t>
+            </w:r>
+          </w:p>
+        </w:tc>
+        <w:tc>
+          <w:tcPr>
+            <w:vAlign w:val="center"/>
+          </w:tcPr>
+          <w:p>
+            <w:pPr>
+              <w:spacing w:line="240" w:lineRule="auto" w:before="60" w:after="60"/>
+              <w:jc w:val="both"/>
+              <w:rPr>
+                <w:rFonts w:ascii="Arial" w:hAnsi="Arial" w:cs="Arial"/>
+                <w:sz w:val="18"/>
+                <w:szCs w:val="18"/>
+              </w:rPr>
+            </w:pPr>
+            <w:r>
+              <w:rPr>
+                <w:rFonts w:ascii="Arial" w:hAnsi="Arial" w:cs="Arial"/>
+                <w:sz w:val="18"/>
+                <w:szCs w:val="18"/>
+              </w:rPr>
+              <w:t xml:space="preserve">Sem monitoramento de desconexão abrupta do gateway</w:t>
+            </w:r>
+          </w:p>
+        </w:tc>
+        <w:tc>
+          <w:tcPr>
+            <w:vAlign w:val="center"/>
+          </w:tcPr>
+          <w:p>
+            <w:pPr>
+              <w:spacing w:line="240" w:lineRule="auto" w:before="60" w:after="60"/>
+              <w:jc w:val="both"/>
+              <w:rPr>
+                <w:rFonts w:ascii="Arial" w:hAnsi="Arial" w:cs="Arial"/>
+                <w:sz w:val="18"/>
+                <w:szCs w:val="18"/>
+              </w:rPr>
+            </w:pPr>
+            <w:r>
+              <w:rPr>
+                <w:rFonts w:ascii="Arial" w:hAnsi="Arial" w:cs="Arial"/>
+                <w:sz w:val="18"/>
+                <w:szCs w:val="18"/>
+              </w:rPr>
+              <w:t xml:space="preserve">Mensagem LWT com QoS 1 e flag Retain em dataflow/status no ESP32</w:t>
+            </w:r>
+          </w:p>
+        </w:tc>
+        <w:tc>
+          <w:tcPr>
+            <w:vAlign w:val="center"/>
+          </w:tcPr>
+          <w:p>
+            <w:pPr>
+              <w:spacing w:line="240" w:lineRule="auto" w:before="60" w:after="60"/>
+              <w:jc w:val="both"/>
+              <w:rPr>
+                <w:rFonts w:ascii="Arial" w:hAnsi="Arial" w:cs="Arial"/>
+                <w:sz w:val="18"/>
+                <w:szCs w:val="18"/>
+              </w:rPr>
+            </w:pPr>
+            <w:r>
+              <w:rPr>
+                <w:rFonts w:ascii="Arial" w:hAnsi="Arial" w:cs="Arial"/>
+                <w:sz w:val="18"/>
+                <w:szCs w:val="18"/>
+              </w:rPr>
+              <w:t xml:space="preserve">Notificação imediata ao broker e dashboard caso o ESP32 perca alimentação ou conexão Wi-Fi.</w:t>
+            </w:r>
+          </w:p>
+        </w:tc>
+      </w:tr>
+      <w:tr>
+        <w:trPr>
+          <w:cantSplit/>
+        </w:trPr>
+        <w:tc>
+          <w:tcPr>
+            <w:vAlign w:val="center"/>
+          </w:tcPr>
+          <w:p>
+            <w:pPr>
+              <w:spacing w:line="240" w:lineRule="auto" w:before="60" w:after="60"/>
+              <w:jc w:val="left"/>
+              <w:rPr>
+                <w:rFonts w:ascii="Arial" w:hAnsi="Arial" w:cs="Arial"/>
+                <w:b/>
+                <w:sz w:val="18"/>
+                <w:szCs w:val="18"/>
+              </w:rPr>
+            </w:pPr>
+            <w:r>
+              <w:rPr>
+                <w:rFonts w:ascii="Arial" w:hAnsi="Arial" w:cs="Arial"/>
+                <w:b/>
+                <w:sz w:val="18"/>
+                <w:szCs w:val="18"/>
+              </w:rPr>
+              <w:t xml:space="preserve">2. Protocolo de Mensageria e Telemetria</w:t>
+            </w:r>
+          </w:p>
+        </w:tc>
+        <w:tc>
+          <w:tcPr>
+            <w:vAlign w:val="center"/>
+          </w:tcPr>
+          <w:p>
+            <w:pPr>
+              <w:spacing w:line="240" w:lineRule="auto" w:before="60" w:after="60"/>
+              <w:jc w:val="left"/>
+              <w:rPr>
+                <w:rFonts w:ascii="Arial" w:hAnsi="Arial" w:cs="Arial"/>
+                <w:b/>
+                <w:sz w:val="18"/>
+                <w:szCs w:val="18"/>
+              </w:rPr>
+            </w:pPr>
+            <w:r>
+              <w:rPr>
+                <w:rFonts w:ascii="Arial" w:hAnsi="Arial" w:cs="Arial"/>
+                <w:b/>
+                <w:sz w:val="18"/>
+                <w:szCs w:val="18"/>
+              </w:rPr>
+              <w:t xml:space="preserve">Sincronismo de Estoque Inicial</w:t>
+            </w:r>
+          </w:p>
+        </w:tc>
+        <w:tc>
+          <w:tcPr>
+            <w:vAlign w:val="center"/>
+          </w:tcPr>
+          <w:p>
+            <w:pPr>
+              <w:spacing w:line="240" w:lineRule="auto" w:before="60" w:after="60"/>
+              <w:jc w:val="both"/>
+              <w:rPr>
+                <w:rFonts w:ascii="Arial" w:hAnsi="Arial" w:cs="Arial"/>
+                <w:sz w:val="18"/>
+                <w:szCs w:val="18"/>
+              </w:rPr>
+            </w:pPr>
+            <w:r>
+              <w:rPr>
+                <w:rFonts w:ascii="Arial" w:hAnsi="Arial" w:cs="Arial"/>
+                <w:sz w:val="18"/>
+                <w:szCs w:val="18"/>
+              </w:rPr>
+              <w:t xml:space="preserve">Publicação de estoque apenas após conclusão de eventos de entrega</w:t>
+            </w:r>
+          </w:p>
+        </w:tc>
+        <w:tc>
+          <w:tcPr>
+            <w:vAlign w:val="center"/>
+          </w:tcPr>
+          <w:p>
+            <w:pPr>
+              <w:spacing w:line="240" w:lineRule="auto" w:before="60" w:after="60"/>
+              <w:jc w:val="both"/>
+              <w:rPr>
+                <w:rFonts w:ascii="Arial" w:hAnsi="Arial" w:cs="Arial"/>
+                <w:sz w:val="18"/>
+                <w:szCs w:val="18"/>
+              </w:rPr>
+            </w:pPr>
+            <w:r>
+              <w:rPr>
+                <w:rFonts w:ascii="Arial" w:hAnsi="Arial" w:cs="Arial"/>
+                <w:sz w:val="18"/>
+                <w:szCs w:val="18"/>
+              </w:rPr>
+              <w:t xml:space="preserve">Publicação Retained em dataflow/estoque no setup() e no CMD:RESET</w:t>
+            </w:r>
+          </w:p>
+        </w:tc>
+        <w:tc>
+          <w:tcPr>
+            <w:vAlign w:val="center"/>
+          </w:tcPr>
+          <w:p>
+            <w:pPr>
+              <w:spacing w:line="240" w:lineRule="auto" w:before="60" w:after="60"/>
+              <w:jc w:val="both"/>
+              <w:rPr>
+                <w:rFonts w:ascii="Arial" w:hAnsi="Arial" w:cs="Arial"/>
+                <w:sz w:val="18"/>
+                <w:szCs w:val="18"/>
+              </w:rPr>
+            </w:pPr>
+            <w:r>
+              <w:rPr>
+                <w:rFonts w:ascii="Arial" w:hAnsi="Arial" w:cs="Arial"/>
+                <w:sz w:val="18"/>
+                <w:szCs w:val="18"/>
+              </w:rPr>
+              <w:t xml:space="preserve">Consistência de estado instantânea para clientes web em cold-start e paridade com display LCD.</w:t>
+            </w:r>
+          </w:p>
+        </w:tc>
+      </w:tr>
+      <w:tr>
+        <w:trPr>
+          <w:cantSplit/>
+        </w:trPr>
+        <w:tc>
+          <w:tcPr>
+            <w:vAlign w:val="center"/>
+          </w:tcPr>
+          <w:p>
+            <w:pPr>
+              <w:spacing w:line="240" w:lineRule="auto" w:before="60" w:after="60"/>
+              <w:jc w:val="left"/>
+              <w:rPr>
+                <w:rFonts w:ascii="Arial" w:hAnsi="Arial" w:cs="Arial"/>
+                <w:b/>
+                <w:sz w:val="18"/>
+                <w:szCs w:val="18"/>
+              </w:rPr>
+            </w:pPr>
+            <w:r>
+              <w:rPr>
+                <w:rFonts w:ascii="Arial" w:hAnsi="Arial" w:cs="Arial"/>
+                <w:b/>
+                <w:sz w:val="18"/>
+                <w:szCs w:val="18"/>
+              </w:rPr>
+              <w:t xml:space="preserve">3. Firmware e Controle em Tempo Real</w:t>
+            </w:r>
+          </w:p>
+        </w:tc>
+        <w:tc>
+          <w:tcPr>
+            <w:vAlign w:val="center"/>
+          </w:tcPr>
+          <w:p>
+            <w:pPr>
+              <w:spacing w:line="240" w:lineRule="auto" w:before="60" w:after="60"/>
+              <w:jc w:val="left"/>
+              <w:rPr>
+                <w:rFonts w:ascii="Arial" w:hAnsi="Arial" w:cs="Arial"/>
+                <w:b/>
+                <w:sz w:val="18"/>
+                <w:szCs w:val="18"/>
+              </w:rPr>
+            </w:pPr>
+            <w:r>
+              <w:rPr>
+                <w:rFonts w:ascii="Arial" w:hAnsi="Arial" w:cs="Arial"/>
+                <w:b/>
+                <w:sz w:val="18"/>
+                <w:szCs w:val="18"/>
+              </w:rPr>
+              <w:t xml:space="preserve">Temporização da Máquina de Estados</w:t>
+            </w:r>
+          </w:p>
+        </w:tc>
+        <w:tc>
+          <w:tcPr>
+            <w:vAlign w:val="center"/>
+          </w:tcPr>
+          <w:p>
+            <w:pPr>
+              <w:spacing w:line="240" w:lineRule="auto" w:before="60" w:after="60"/>
+              <w:jc w:val="both"/>
+              <w:rPr>
+                <w:rFonts w:ascii="Arial" w:hAnsi="Arial" w:cs="Arial"/>
+                <w:sz w:val="18"/>
+                <w:szCs w:val="18"/>
+              </w:rPr>
+            </w:pPr>
+            <w:r>
+              <w:rPr>
+                <w:rFonts w:ascii="Arial" w:hAnsi="Arial" w:cs="Arial"/>
+                <w:sz w:val="18"/>
+                <w:szCs w:val="18"/>
+              </w:rPr>
+              <w:t xml:space="preserve">TIMEOUT_ENTREGA = 3000 ms sem tempo de saída de esteira</w:t>
+            </w:r>
+          </w:p>
+        </w:tc>
+        <w:tc>
+          <w:tcPr>
+            <w:vAlign w:val="center"/>
+          </w:tcPr>
+          <w:p>
+            <w:pPr>
+              <w:spacing w:line="240" w:lineRule="auto" w:before="60" w:after="60"/>
+              <w:jc w:val="both"/>
+              <w:rPr>
+                <w:rFonts w:ascii="Arial" w:hAnsi="Arial" w:cs="Arial"/>
+                <w:sz w:val="18"/>
+                <w:szCs w:val="18"/>
+              </w:rPr>
+            </w:pPr>
+            <w:r>
+              <w:rPr>
+                <w:rFonts w:ascii="Arial" w:hAnsi="Arial" w:cs="Arial"/>
+                <w:sz w:val="18"/>
+                <w:szCs w:val="18"/>
+              </w:rPr>
+              <w:t xml:space="preserve">TIMEOUT_ENTREGA = 9000 ms + TEMPO_SAIDA_ESTEIRA_MS = 3000 ms (não-bloqueante)</w:t>
+            </w:r>
+          </w:p>
+        </w:tc>
+        <w:tc>
+          <w:tcPr>
+            <w:vAlign w:val="center"/>
+          </w:tcPr>
+          <w:p>
+            <w:pPr>
+              <w:spacing w:line="240" w:lineRule="auto" w:before="60" w:after="60"/>
+              <w:jc w:val="both"/>
+              <w:rPr>
+                <w:rFonts w:ascii="Arial" w:hAnsi="Arial" w:cs="Arial"/>
+                <w:sz w:val="18"/>
+                <w:szCs w:val="18"/>
+              </w:rPr>
+            </w:pPr>
+            <w:r>
+              <w:rPr>
+                <w:rFonts w:ascii="Arial" w:hAnsi="Arial" w:cs="Arial"/>
+                <w:sz w:val="18"/>
+                <w:szCs w:val="18"/>
+              </w:rPr>
+              <w:t xml:space="preserve">Acomoda o tempo físico real de trânsito da peça (~5 s) e escoamento, eliminando falsos timeouts.</w:t>
+            </w:r>
+          </w:p>
+        </w:tc>
+      </w:tr>
+      <w:tr>
+        <w:trPr>
+          <w:cantSplit/>
+        </w:trPr>
+        <w:tc>
+          <w:tcPr>
+            <w:vAlign w:val="center"/>
+          </w:tcPr>
+          <w:p>
+            <w:pPr>
+              <w:spacing w:line="240" w:lineRule="auto" w:before="60" w:after="60"/>
+              <w:jc w:val="left"/>
+              <w:rPr>
+                <w:rFonts w:ascii="Arial" w:hAnsi="Arial" w:cs="Arial"/>
+                <w:b/>
+                <w:sz w:val="18"/>
+                <w:szCs w:val="18"/>
+              </w:rPr>
+            </w:pPr>
+            <w:r>
+              <w:rPr>
+                <w:rFonts w:ascii="Arial" w:hAnsi="Arial" w:cs="Arial"/>
+                <w:b/>
+                <w:sz w:val="18"/>
+                <w:szCs w:val="18"/>
+              </w:rPr>
+              <w:t xml:space="preserve">3. Firmware e Controle em Tempo Real</w:t>
+            </w:r>
+          </w:p>
+        </w:tc>
+        <w:tc>
+          <w:tcPr>
+            <w:vAlign w:val="center"/>
+          </w:tcPr>
+          <w:p>
+            <w:pPr>
+              <w:spacing w:line="240" w:lineRule="auto" w:before="60" w:after="60"/>
+              <w:jc w:val="left"/>
+              <w:rPr>
+                <w:rFonts w:ascii="Arial" w:hAnsi="Arial" w:cs="Arial"/>
+                <w:b/>
+                <w:sz w:val="18"/>
+                <w:szCs w:val="18"/>
+              </w:rPr>
+            </w:pPr>
+            <w:r>
+              <w:rPr>
+                <w:rFonts w:ascii="Arial" w:hAnsi="Arial" w:cs="Arial"/>
+                <w:b/>
+                <w:sz w:val="18"/>
+                <w:szCs w:val="18"/>
+              </w:rPr>
+              <w:t xml:space="preserve">Parser de Comandos e Resiliência</w:t>
+            </w:r>
+          </w:p>
+        </w:tc>
+        <w:tc>
+          <w:tcPr>
+            <w:vAlign w:val="center"/>
+          </w:tcPr>
+          <w:p>
+            <w:pPr>
+              <w:spacing w:line="240" w:lineRule="auto" w:before="60" w:after="60"/>
+              <w:jc w:val="both"/>
+              <w:rPr>
+                <w:rFonts w:ascii="Arial" w:hAnsi="Arial" w:cs="Arial"/>
+                <w:sz w:val="18"/>
+                <w:szCs w:val="18"/>
+              </w:rPr>
+            </w:pPr>
+            <w:r>
+              <w:rPr>
+                <w:rFonts w:ascii="Arial" w:hAnsi="Arial" w:cs="Arial"/>
+                <w:sz w:val="18"/>
+                <w:szCs w:val="18"/>
+              </w:rPr>
+              <w:t xml:space="preserve">Serial.readStringUntil() bloqueante e tratamento estrito</w:t>
+            </w:r>
+          </w:p>
+        </w:tc>
+        <w:tc>
+          <w:tcPr>
+            <w:vAlign w:val="center"/>
+          </w:tcPr>
+          <w:p>
+            <w:pPr>
+              <w:spacing w:line="240" w:lineRule="auto" w:before="60" w:after="60"/>
+              <w:jc w:val="both"/>
+              <w:rPr>
+                <w:rFonts w:ascii="Arial" w:hAnsi="Arial" w:cs="Arial"/>
+                <w:sz w:val="18"/>
+                <w:szCs w:val="18"/>
+              </w:rPr>
+            </w:pPr>
+            <w:r>
+              <w:rPr>
+                <w:rFonts w:ascii="Arial" w:hAnsi="Arial" w:cs="Arial"/>
+                <w:sz w:val="18"/>
+                <w:szCs w:val="18"/>
+              </w:rPr>
+              <w:t xml:space="preserve">Acumulador não-bloqueante orientado a \n, startsWith para CMD:RESET e rejeições explícitas</w:t>
+            </w:r>
+          </w:p>
+        </w:tc>
+        <w:tc>
+          <w:tcPr>
+            <w:vAlign w:val="center"/>
+          </w:tcPr>
+          <w:p>
+            <w:pPr>
+              <w:spacing w:line="240" w:lineRule="auto" w:before="60" w:after="60"/>
+              <w:jc w:val="both"/>
+              <w:rPr>
+                <w:rFonts w:ascii="Arial" w:hAnsi="Arial" w:cs="Arial"/>
+                <w:sz w:val="18"/>
+                <w:szCs w:val="18"/>
+              </w:rPr>
+            </w:pPr>
+            <w:r>
+              <w:rPr>
+                <w:rFonts w:ascii="Arial" w:hAnsi="Arial" w:cs="Arial"/>
+                <w:sz w:val="18"/>
+                <w:szCs w:val="18"/>
+              </w:rPr>
+              <w:t xml:space="preserve">FSM imune a congelamentos por I/O serial e tratamento determinístico de comandos inválidos ou ocupados.</w:t>
+            </w:r>
+          </w:p>
+        </w:tc>
+      </w:tr>
+      <w:tr>
+        <w:trPr>
+          <w:cantSplit/>
+        </w:trPr>
+        <w:tc>
+          <w:tcPr>
+            <w:vAlign w:val="center"/>
+          </w:tcPr>
+          <w:p>
+            <w:pPr>
+              <w:spacing w:line="240" w:lineRule="auto" w:before="60" w:after="60"/>
+              <w:jc w:val="left"/>
+              <w:rPr>
+                <w:rFonts w:ascii="Arial" w:hAnsi="Arial" w:cs="Arial"/>
+                <w:b/>
+                <w:sz w:val="18"/>
+                <w:szCs w:val="18"/>
+              </w:rPr>
+            </w:pPr>
+            <w:r>
+              <w:rPr>
+                <w:rFonts w:ascii="Arial" w:hAnsi="Arial" w:cs="Arial"/>
+                <w:b/>
+                <w:sz w:val="18"/>
+                <w:szCs w:val="18"/>
+              </w:rPr>
+              <w:t xml:space="preserve">3. Firmware e Controle em Tempo Real</w:t>
+            </w:r>
+          </w:p>
+        </w:tc>
+        <w:tc>
+          <w:tcPr>
+            <w:vAlign w:val="center"/>
+          </w:tcPr>
+          <w:p>
+            <w:pPr>
+              <w:spacing w:line="240" w:lineRule="auto" w:before="60" w:after="60"/>
+              <w:jc w:val="left"/>
+              <w:rPr>
+                <w:rFonts w:ascii="Arial" w:hAnsi="Arial" w:cs="Arial"/>
+                <w:b/>
+                <w:sz w:val="18"/>
+                <w:szCs w:val="18"/>
+              </w:rPr>
+            </w:pPr>
+            <w:r>
+              <w:rPr>
+                <w:rFonts w:ascii="Arial" w:hAnsi="Arial" w:cs="Arial"/>
+                <w:b/>
+                <w:sz w:val="18"/>
+                <w:szCs w:val="18"/>
+              </w:rPr>
+              <w:t xml:space="preserve">Interface de Operação Local vs Remota</w:t>
+            </w:r>
+          </w:p>
+        </w:tc>
+        <w:tc>
+          <w:tcPr>
+            <w:vAlign w:val="center"/>
+          </w:tcPr>
+          <w:p>
+            <w:pPr>
+              <w:spacing w:line="240" w:lineRule="auto" w:before="60" w:after="60"/>
+              <w:jc w:val="both"/>
+              <w:rPr>
+                <w:rFonts w:ascii="Arial" w:hAnsi="Arial" w:cs="Arial"/>
+                <w:sz w:val="18"/>
+                <w:szCs w:val="18"/>
+              </w:rPr>
+            </w:pPr>
+            <w:r>
+              <w:rPr>
+                <w:rFonts w:ascii="Arial" w:hAnsi="Arial" w:cs="Arial"/>
+                <w:sz w:val="18"/>
+                <w:szCs w:val="18"/>
+              </w:rPr>
+              <w:t xml:space="preserve">4 botões físicos de solicitação montados na bancada do Uno</w:t>
+            </w:r>
+          </w:p>
+        </w:tc>
+        <w:tc>
+          <w:tcPr>
+            <w:vAlign w:val="center"/>
+          </w:tcPr>
+          <w:p>
+            <w:pPr>
+              <w:spacing w:line="240" w:lineRule="auto" w:before="60" w:after="60"/>
+              <w:jc w:val="both"/>
+              <w:rPr>
+                <w:rFonts w:ascii="Arial" w:hAnsi="Arial" w:cs="Arial"/>
+                <w:sz w:val="18"/>
+                <w:szCs w:val="18"/>
+              </w:rPr>
+            </w:pPr>
+            <w:r>
+              <w:rPr>
+                <w:rFonts w:ascii="Arial" w:hAnsi="Arial" w:cs="Arial"/>
+                <w:sz w:val="18"/>
+                <w:szCs w:val="18"/>
+              </w:rPr>
+              <w:t xml:space="preserve">Botões desabilitados; acionamento centralizado via Dashboard Web</w:t>
+            </w:r>
+          </w:p>
+        </w:tc>
+        <w:tc>
+          <w:tcPr>
+            <w:vAlign w:val="center"/>
+          </w:tcPr>
+          <w:p>
+            <w:pPr>
+              <w:spacing w:line="240" w:lineRule="auto" w:before="60" w:after="60"/>
+              <w:jc w:val="both"/>
+              <w:rPr>
+                <w:rFonts w:ascii="Arial" w:hAnsi="Arial" w:cs="Arial"/>
+                <w:sz w:val="18"/>
+                <w:szCs w:val="18"/>
+              </w:rPr>
+            </w:pPr>
+            <w:r>
+              <w:rPr>
+                <w:rFonts w:ascii="Arial" w:hAnsi="Arial" w:cs="Arial"/>
+                <w:sz w:val="18"/>
+                <w:szCs w:val="18"/>
+              </w:rPr>
+              <w:t xml:space="preserve">Racionalização de hardware e validação efetiva do paradigma de intralogística IoT remota.</w:t>
+            </w:r>
+          </w:p>
+        </w:tc>
+      </w:tr>
+      <w:tr>
+        <w:trPr>
+          <w:cantSplit/>
+        </w:trPr>
+        <w:tc>
+          <w:tcPr>
+            <w:vAlign w:val="center"/>
+          </w:tcPr>
+          <w:p>
+            <w:pPr>
+              <w:spacing w:line="240" w:lineRule="auto" w:before="60" w:after="60"/>
+              <w:jc w:val="left"/>
+              <w:rPr>
+                <w:rFonts w:ascii="Arial" w:hAnsi="Arial" w:cs="Arial"/>
+                <w:b/>
+                <w:sz w:val="18"/>
+                <w:szCs w:val="18"/>
+              </w:rPr>
+            </w:pPr>
+            <w:r>
+              <w:rPr>
+                <w:rFonts w:ascii="Arial" w:hAnsi="Arial" w:cs="Arial"/>
+                <w:b/>
+                <w:sz w:val="18"/>
+                <w:szCs w:val="18"/>
+              </w:rPr>
+              <w:t xml:space="preserve">4. Metodologia e Observabilidade</w:t>
+            </w:r>
+          </w:p>
+        </w:tc>
+        <w:tc>
+          <w:tcPr>
+            <w:vAlign w:val="center"/>
+          </w:tcPr>
+          <w:p>
+            <w:pPr>
+              <w:spacing w:line="240" w:lineRule="auto" w:before="60" w:after="60"/>
+              <w:jc w:val="left"/>
+              <w:rPr>
+                <w:rFonts w:ascii="Arial" w:hAnsi="Arial" w:cs="Arial"/>
+                <w:b/>
+                <w:sz w:val="18"/>
+                <w:szCs w:val="18"/>
+              </w:rPr>
+            </w:pPr>
+            <w:r>
+              <w:rPr>
+                <w:rFonts w:ascii="Arial" w:hAnsi="Arial" w:cs="Arial"/>
+                <w:b/>
+                <w:sz w:val="18"/>
+                <w:szCs w:val="18"/>
+              </w:rPr>
+              <w:t xml:space="preserve">Ambiente de Servidor e Visualização</w:t>
+            </w:r>
+          </w:p>
+        </w:tc>
+        <w:tc>
+          <w:tcPr>
+            <w:vAlign w:val="center"/>
+          </w:tcPr>
+          <w:p>
+            <w:pPr>
+              <w:spacing w:line="240" w:lineRule="auto" w:before="60" w:after="60"/>
+              <w:jc w:val="both"/>
+              <w:rPr>
+                <w:rFonts w:ascii="Arial" w:hAnsi="Arial" w:cs="Arial"/>
+                <w:sz w:val="18"/>
+                <w:szCs w:val="18"/>
+              </w:rPr>
+            </w:pPr>
+            <w:r>
+              <w:rPr>
+                <w:rFonts w:ascii="Arial" w:hAnsi="Arial" w:cs="Arial"/>
+                <w:sz w:val="18"/>
+                <w:szCs w:val="18"/>
+              </w:rPr>
+              <w:t xml:space="preserve">Node-RED ou plataforma em nuvem proprietária (Ubidots)</w:t>
+            </w:r>
+          </w:p>
+        </w:tc>
+        <w:tc>
+          <w:tcPr>
+            <w:vAlign w:val="center"/>
+          </w:tcPr>
+          <w:p>
+            <w:pPr>
+              <w:spacing w:line="240" w:lineRule="auto" w:before="60" w:after="60"/>
+              <w:jc w:val="both"/>
+              <w:rPr>
+                <w:rFonts w:ascii="Arial" w:hAnsi="Arial" w:cs="Arial"/>
+                <w:sz w:val="18"/>
+                <w:szCs w:val="18"/>
+              </w:rPr>
+            </w:pPr>
+            <w:r>
+              <w:rPr>
+                <w:rFonts w:ascii="Arial" w:hAnsi="Arial" w:cs="Arial"/>
+                <w:sz w:val="18"/>
+                <w:szCs w:val="18"/>
+              </w:rPr>
+              <w:t xml:space="preserve">Servidor Node.js (Express + Socket.IO + MQTT.js) próprio com rate limiting e endpoint /api/status</w:t>
+            </w:r>
+          </w:p>
+        </w:tc>
+        <w:tc>
+          <w:tcPr>
+            <w:vAlign w:val="center"/>
+          </w:tcPr>
+          <w:p>
+            <w:pPr>
+              <w:spacing w:line="240" w:lineRule="auto" w:before="60" w:after="60"/>
+              <w:jc w:val="both"/>
+              <w:rPr>
+                <w:rFonts w:ascii="Arial" w:hAnsi="Arial" w:cs="Arial"/>
+                <w:sz w:val="18"/>
+                <w:szCs w:val="18"/>
+              </w:rPr>
+            </w:pPr>
+            <w:r>
+              <w:rPr>
+                <w:rFonts w:ascii="Arial" w:hAnsi="Arial" w:cs="Arial"/>
+                <w:sz w:val="18"/>
+                <w:szCs w:val="18"/>
+              </w:rPr>
+              <w:t xml:space="preserve">Dashboard customizado, baixa latência via WebSocket, telemetria completa e independência de planos pagos.</w:t>
+            </w:r>
+          </w:p>
+        </w:tc>
+      </w:tr>
+      <w:tr>
+        <w:trPr>
+          <w:cantSplit/>
+        </w:trPr>
+        <w:tc>
+          <w:tcPr>
+            <w:vAlign w:val="center"/>
+          </w:tcPr>
+          <w:p>
+            <w:pPr>
+              <w:spacing w:line="240" w:lineRule="auto" w:before="60" w:after="60"/>
+              <w:jc w:val="left"/>
+              <w:rPr>
+                <w:rFonts w:ascii="Arial" w:hAnsi="Arial" w:cs="Arial"/>
+                <w:b/>
+                <w:sz w:val="18"/>
+                <w:szCs w:val="18"/>
+              </w:rPr>
+            </w:pPr>
+            <w:r>
+              <w:rPr>
+                <w:rFonts w:ascii="Arial" w:hAnsi="Arial" w:cs="Arial"/>
+                <w:b/>
+                <w:sz w:val="18"/>
+                <w:szCs w:val="18"/>
+              </w:rPr>
+              <w:t xml:space="preserve">4. Metodologia e Observabilidade</w:t>
+            </w:r>
+          </w:p>
+        </w:tc>
+        <w:tc>
+          <w:tcPr>
+            <w:vAlign w:val="center"/>
+          </w:tcPr>
+          <w:p>
+            <w:pPr>
+              <w:spacing w:line="240" w:lineRule="auto" w:before="60" w:after="60"/>
+              <w:jc w:val="left"/>
+              <w:rPr>
+                <w:rFonts w:ascii="Arial" w:hAnsi="Arial" w:cs="Arial"/>
+                <w:b/>
+                <w:sz w:val="18"/>
+                <w:szCs w:val="18"/>
+              </w:rPr>
+            </w:pPr>
+            <w:r>
+              <w:rPr>
+                <w:rFonts w:ascii="Arial" w:hAnsi="Arial" w:cs="Arial"/>
+                <w:b/>
+                <w:sz w:val="18"/>
+                <w:szCs w:val="18"/>
+              </w:rPr>
+              <w:t xml:space="preserve">Validação em Camadas (Local-First)</w:t>
+            </w:r>
+          </w:p>
+        </w:tc>
+        <w:tc>
+          <w:tcPr>
+            <w:vAlign w:val="center"/>
+          </w:tcPr>
+          <w:p>
+            <w:pPr>
+              <w:spacing w:line="240" w:lineRule="auto" w:before="60" w:after="60"/>
+              <w:jc w:val="both"/>
+              <w:rPr>
+                <w:rFonts w:ascii="Arial" w:hAnsi="Arial" w:cs="Arial"/>
+                <w:sz w:val="18"/>
+                <w:szCs w:val="18"/>
+              </w:rPr>
+            </w:pPr>
+            <w:r>
+              <w:rPr>
+                <w:rFonts w:ascii="Arial" w:hAnsi="Arial" w:cs="Arial"/>
+                <w:sz w:val="18"/>
+                <w:szCs w:val="18"/>
+              </w:rPr>
+              <w:t xml:space="preserve">Conexão direta à nuvem HiveMQ TLS em todos os cenários de teste</w:t>
+            </w:r>
+          </w:p>
+        </w:tc>
+        <w:tc>
+          <w:tcPr>
+            <w:vAlign w:val="center"/>
+          </w:tcPr>
+          <w:p>
+            <w:pPr>
+              <w:spacing w:line="240" w:lineRule="auto" w:before="60" w:after="60"/>
+              <w:jc w:val="both"/>
+              <w:rPr>
+                <w:rFonts w:ascii="Arial" w:hAnsi="Arial" w:cs="Arial"/>
+                <w:sz w:val="18"/>
+                <w:szCs w:val="18"/>
+              </w:rPr>
+            </w:pPr>
+            <w:r>
+              <w:rPr>
+                <w:rFonts w:ascii="Arial" w:hAnsi="Arial" w:cs="Arial"/>
+                <w:sz w:val="18"/>
+                <w:szCs w:val="18"/>
+              </w:rPr>
+              <w:t xml:space="preserve">Validação em bancada via Mosquitto local (1883) antes da nuvem + Simulador Offline + mqtt_probe</w:t>
+            </w:r>
+          </w:p>
+        </w:tc>
+        <w:tc>
+          <w:tcPr>
+            <w:vAlign w:val="center"/>
+          </w:tcPr>
+          <w:p>
+            <w:pPr>
+              <w:spacing w:line="240" w:lineRule="auto" w:before="60" w:after="60"/>
+              <w:jc w:val="both"/>
+              <w:rPr>
+                <w:rFonts w:ascii="Arial" w:hAnsi="Arial" w:cs="Arial"/>
+                <w:sz w:val="18"/>
+                <w:szCs w:val="18"/>
+              </w:rPr>
+            </w:pPr>
+            <w:r>
+              <w:rPr>
+                <w:rFonts w:ascii="Arial" w:hAnsi="Arial" w:cs="Arial"/>
+                <w:sz w:val="18"/>
+                <w:szCs w:val="18"/>
+              </w:rPr>
+              <w:t xml:space="preserve">Desacoplamento de testes de hardware, rede e frontend; depuração rápida e determinística.</w:t>
+            </w:r>
+          </w:p>
+        </w:tc>
+      </w:tr>
+    </w:tbl>
+    <w:p>
+      <w:pPr>
+        <w:spacing w:line="360" w:lineRule="auto"/>
+        <w:jc w:val="both"/>
+        <w:rPr>
+          <w:rFonts w:ascii="Arial" w:hAnsi="Arial" w:cs="Arial"/>
+          <w:color w:val="000000" w:themeColor="text1"/>
+          <w:sz w:val="24"/>
+          <w:szCs w:val="24"/>
+        </w:rPr>
+      </w:pPr>
+      <w:r>
+        <w:rPr>
+          <w:rFonts w:ascii="Arial" w:hAnsi="Arial" w:cs="Arial"/>
+          <w:color w:val="000000" w:themeColor="text1"/>
+          <w:sz w:val="24"/>
+          <w:szCs w:val="24"/>
+        </w:rPr>
+        <w:t xml:space="preserve">Essa reformulação arquitetural e metodológica garantiu que o sistema operasse com alta confiabilidade determinística, baixo tempo de latência na entrega de dados e total imunidade a falhas de comunicação serial e colisões de rede, viabilizando a validação integral da planta em escala reduzida.</w:t>
+      </w:r>
+    </w:p>
     <w:p>
       <w:pPr>
         <w:pStyle w:val="Ttulo1"/>
@@ -2934,7 +5148,7 @@
 </w:document>
 </file>
 
-<file path=word/endnotes.xml><?xml version="1.0" encoding="utf-8"?>
+<file path=word\endnotes.xml><?xml version="1.0" encoding="utf-8"?>
 <w:endnotes xmlns:wpc="http://schemas.microsoft.com/office/word/2010/wordprocessingCanvas" xmlns:cx="http://schemas.microsoft.com/office/drawing/2014/chartex" xmlns:cx1="http://schemas.microsoft.com/office/drawing/2015/9/8/chartex" xmlns:cx2="http://schemas.microsoft.com/office/drawing/2015/10/21/chartex" xmlns:cx3="http://schemas.microsoft.com/office/drawing/2016/5/9/chartex" xmlns:cx4="http://schemas.microsoft.com/office/drawing/2016/5/10/chartex" xmlns:cx5="http://schemas.microsoft.com/office/drawing/2016/5/11/chartex" xmlns:cx6="http://schemas.microsoft.com/office/drawing/2016/5/12/chartex" xmlns:cx7="http://schemas.microsoft.com/office/drawing/2016/5/13/chartex" xmlns:cx8="http://schemas.microsoft.com/office/drawing/2016/5/14/chartex" xmlns:mc="http://schemas.openxmlformats.org/markup-compatibility/2006" xmlns:aink="http://schemas.microsoft.com/office/drawing/2016/ink" xmlns:am3d="http://schemas.microsoft.com/office/drawing/2017/model3d" xmlns:o="urn:schemas-microsoft-com:office:office" xmlns:oel="http://schemas.microsoft.com/office/2019/extlst" xmlns:r="http://schemas.openxmlformats.org/officeDocument/2006/relationships" xmlns:m="http://schemas.openxmlformats.org/officeDocument/2006/math" xmlns:v="urn:schemas-microsoft-com:vml" xmlns:wp14="http://schemas.microsoft.com/office/word/2010/wordprocessingDrawing" xmlns:wp="http://schemas.openxmlformats.org/drawingml/2006/wordprocessingDrawing" xmlns:w10="urn:schemas-microsoft-com:office:word" xmlns:w="http://schemas.openxmlformats.org/wordprocessingml/2006/main" xmlns:w14="http://schemas.microsoft.com/office/word/2010/wordml" xmlns:w15="http://schemas.microsoft.com/office/word/2012/wordml" xmlns:w16cei="http://schemas.microsoft.com/office/word/2026/wordml/cei" xmlns:w16cex="http://schemas.microsoft.com/office/word/2018/wordml/cex" xmlns:w16cid="http://schemas.microsoft.com/office/word/2016/wordml/cid" xmlns:w16="http://schemas.microsoft.com/office/word/2018/wordml" xmlns:w16du="http://schemas.microsoft.com/office/word/2023/wordml/word16du" xmlns:w16sdtdh="http://schemas.microsoft.com/office/word/2020/wordml/sdtdatahash" xmlns:w16sdtfl="http://schemas.microsoft.com/office/word/2024/wordml/sdtformatlock" xmlns:w16se="http://schemas.microsoft.com/office/word/2015/wordml/symex" xmlns:wpg="http://schemas.microsoft.com/office/word/2010/wordprocessingGroup" xmlns:wpi="http://schemas.microsoft.com/office/word/2010/wordprocessingInk" xmlns:wne="http://schemas.microsoft.com/office/word/2006/wordml" xmlns:wps="http://schemas.microsoft.com/office/word/2010/wordprocessingShape" mc:Ignorable="w14 w15 w16se w16cid w16 w16cex w16sdtdh w16sdtfl w16du wp14">
   <w:endnote w:type="separator" w:id="-1">
     <w:p>
@@ -2953,7 +5167,55 @@
 </w:endnotes>
 </file>
 
-<file path=word/footnotes.xml><?xml version="1.0" encoding="utf-8"?>
+<file path=word\fontTable.xml><?xml version="1.0" encoding="utf-8"?>
+<w:fonts xmlns:mc="http://schemas.openxmlformats.org/markup-compatibility/2006" xmlns:r="http://schemas.openxmlformats.org/officeDocument/2006/relationships" xmlns:w="http://schemas.openxmlformats.org/wordprocessingml/2006/main" xmlns:w14="http://schemas.microsoft.com/office/word/2010/wordml" xmlns:w15="http://schemas.microsoft.com/office/word/2012/wordml" xmlns:w16cex="http://schemas.microsoft.com/office/word/2018/wordml/cex" xmlns:w16cid="http://schemas.microsoft.com/office/word/2016/wordml/cid" xmlns:w16="http://schemas.microsoft.com/office/word/2018/wordml" xmlns:w16du="http://schemas.microsoft.com/office/word/2023/wordml/word16du" xmlns:w16sdtdh="http://schemas.microsoft.com/office/word/2020/wordml/sdtdatahash" xmlns:w16sdtfl="http://schemas.microsoft.com/office/word/2024/wordml/sdtformatlock" xmlns:w16se="http://schemas.microsoft.com/office/word/2015/wordml/symex" mc:Ignorable="w14 w15 w16se w16cid w16 w16cex w16sdtdh w16sdtfl w16du">
+  <w:font w:name="Arial">
+    <w:panose1 w:val="020B0604020202020204"/>
+    <w:charset w:val="00"/>
+    <w:family w:val="swiss"/>
+    <w:pitch w:val="variable"/>
+    <w:sig w:usb0="E0002EFF" w:usb1="C000785B" w:usb2="00000009" w:usb3="00000000" w:csb0="000001FF" w:csb1="00000000"/>
+  </w:font>
+  <w:font w:name="Times New Roman">
+    <w:panose1 w:val="02020603050405020304"/>
+    <w:charset w:val="00"/>
+    <w:family w:val="roman"/>
+    <w:pitch w:val="variable"/>
+    <w:sig w:usb0="E0002EFF" w:usb1="C000785B" w:usb2="00000009" w:usb3="00000000" w:csb0="000001FF" w:csb1="00000000"/>
+  </w:font>
+  <w:font w:name="SimSun">
+    <w:altName w:val="宋体"/>
+    <w:panose1 w:val="02010600030101010101"/>
+    <w:charset w:val="86"/>
+    <w:family w:val="auto"/>
+    <w:pitch w:val="variable"/>
+    <w:sig w:usb0="00000203" w:usb1="288F0000" w:usb2="00000016" w:usb3="00000000" w:csb0="00040001" w:csb1="00000000"/>
+  </w:font>
+  <w:font w:name="Cambria">
+    <w:panose1 w:val="02040503050406030204"/>
+    <w:charset w:val="00"/>
+    <w:family w:val="roman"/>
+    <w:pitch w:val="variable"/>
+    <w:sig w:usb0="E00006FF" w:usb1="420024FF" w:usb2="02000000" w:usb3="00000000" w:csb0="0000019F" w:csb1="00000000"/>
+  </w:font>
+  <w:font w:name="Tahoma">
+    <w:panose1 w:val="020B0604030504040204"/>
+    <w:charset w:val="00"/>
+    <w:family w:val="swiss"/>
+    <w:pitch w:val="variable"/>
+    <w:sig w:usb0="E1002EFF" w:usb1="C000605B" w:usb2="00000029" w:usb3="00000000" w:csb0="000101FF" w:csb1="00000000"/>
+  </w:font>
+  <w:font w:name="Calibri">
+    <w:panose1 w:val="020F0502020204030204"/>
+    <w:charset w:val="00"/>
+    <w:family w:val="swiss"/>
+    <w:pitch w:val="variable"/>
+    <w:sig w:usb0="E4002EFF" w:usb1="C200247B" w:usb2="00000009" w:usb3="00000000" w:csb0="000001FF" w:csb1="00000000"/>
+  </w:font>
+</w:fonts>
+</file>
+
+<file path=word\footnotes.xml><?xml version="1.0" encoding="utf-8"?>
 <w:footnotes xmlns:wpc="http://schemas.microsoft.com/office/word/2010/wordprocessingCanvas" xmlns:cx="http://schemas.microsoft.com/office/drawing/2014/chartex" xmlns:cx1="http://schemas.microsoft.com/office/drawing/2015/9/8/chartex" xmlns:cx2="http://schemas.microsoft.com/office/drawing/2015/10/21/chartex" xmlns:cx3="http://schemas.microsoft.com/office/drawing/2016/5/9/chartex" xmlns:cx4="http://schemas.microsoft.com/office/drawing/2016/5/10/chartex" xmlns:cx5="http://schemas.microsoft.com/office/drawing/2016/5/11/chartex" xmlns:cx6="http://schemas.microsoft.com/office/drawing/2016/5/12/chartex" xmlns:cx7="http://schemas.microsoft.com/office/drawing/2016/5/13/chartex" xmlns:cx8="http://schemas.microsoft.com/office/drawing/2016/5/14/chartex" xmlns:mc="http://schemas.openxmlformats.org/markup-compatibility/2006" xmlns:aink="http://schemas.microsoft.com/office/drawing/2016/ink" xmlns:am3d="http://schemas.microsoft.com/office/drawing/2017/model3d" xmlns:o="urn:schemas-microsoft-com:office:office" xmlns:oel="http://schemas.microsoft.com/office/2019/extlst" xmlns:r="http://schemas.openxmlformats.org/officeDocument/2006/relationships" xmlns:m="http://schemas.openxmlformats.org/officeDocument/2006/math" xmlns:v="urn:schemas-microsoft-com:vml" xmlns:wp14="http://schemas.microsoft.com/office/word/2010/wordprocessingDrawing" xmlns:wp="http://schemas.openxmlformats.org/drawingml/2006/wordprocessingDrawing" xmlns:w10="urn:schemas-microsoft-com:office:word" xmlns:w="http://schemas.openxmlformats.org/wordprocessingml/2006/main" xmlns:w14="http://schemas.microsoft.com/office/word/2010/wordml" xmlns:w15="http://schemas.microsoft.com/office/word/2012/wordml" xmlns:w16cei="http://schemas.microsoft.com/office/word/2026/wordml/cei" xmlns:w16cex="http://schemas.microsoft.com/office/word/2018/wordml/cex" xmlns:w16cid="http://schemas.microsoft.com/office/word/2016/wordml/cid" xmlns:w16="http://schemas.microsoft.com/office/word/2018/wordml" xmlns:w16du="http://schemas.microsoft.com/office/word/2023/wordml/word16du" xmlns:w16sdtdh="http://schemas.microsoft.com/office/word/2020/wordml/sdtdatahash" xmlns:w16sdtfl="http://schemas.microsoft.com/office/word/2024/wordml/sdtformatlock" xmlns:w16se="http://schemas.microsoft.com/office/word/2015/wordml/symex" xmlns:wpg="http://schemas.microsoft.com/office/word/2010/wordprocessingGroup" xmlns:wpi="http://schemas.microsoft.com/office/word/2010/wordprocessingInk" xmlns:wne="http://schemas.microsoft.com/office/word/2006/wordml" xmlns:wps="http://schemas.microsoft.com/office/word/2010/wordprocessingShape" mc:Ignorable="w14 w15 w16se w16cid w16 w16cex w16sdtdh w16sdtfl w16du wp14">
   <w:footnote w:type="separator" w:id="-1">
     <w:p>
@@ -2972,7 +5234,7 @@
 </w:footnotes>
 </file>
 
-<file path=word/header1.xml><?xml version="1.0" encoding="utf-8"?>
+<file path=word\header1.xml><?xml version="1.0" encoding="utf-8"?>
 <w:hdr xmlns:wpc="http://schemas.microsoft.com/office/word/2010/wordprocessingCanvas" xmlns:cx="http://schemas.microsoft.com/office/drawing/2014/chartex" xmlns:cx1="http://schemas.microsoft.com/office/drawing/2015/9/8/chartex" xmlns:cx2="http://schemas.microsoft.com/office/drawing/2015/10/21/chartex" xmlns:cx3="http://schemas.microsoft.com/office/drawing/2016/5/9/chartex" xmlns:cx4="http://schemas.microsoft.com/office/drawing/2016/5/10/chartex" xmlns:cx5="http://schemas.microsoft.com/office/drawing/2016/5/11/chartex" xmlns:cx6="http://schemas.microsoft.com/office/drawing/2016/5/12/chartex" xmlns:cx7="http://schemas.microsoft.com/office/drawing/2016/5/13/chartex" xmlns:cx8="http://schemas.microsoft.com/office/drawing/2016/5/14/chartex" xmlns:mc="http://schemas.openxmlformats.org/markup-compatibility/2006" xmlns:aink="http://schemas.microsoft.com/office/drawing/2016/ink" xmlns:am3d="http://schemas.microsoft.com/office/drawing/2017/model3d" xmlns:o="urn:schemas-microsoft-com:office:office" xmlns:oel="http://schemas.microsoft.com/office/2019/extlst" xmlns:r="http://schemas.openxmlformats.org/officeDocument/2006/relationships" xmlns:m="http://schemas.openxmlformats.org/officeDocument/2006/math" xmlns:v="urn:schemas-microsoft-com:vml" xmlns:wp14="http://schemas.microsoft.com/office/word/2010/wordprocessingDrawing" xmlns:wp="http://schemas.openxmlformats.org/drawingml/2006/wordprocessingDrawing" xmlns:w10="urn:schemas-microsoft-com:office:word" xmlns:w="http://schemas.openxmlformats.org/wordprocessingml/2006/main" xmlns:w14="http://schemas.microsoft.com/office/word/2010/wordml" xmlns:w15="http://schemas.microsoft.com/office/word/2012/wordml" xmlns:w16cei="http://schemas.microsoft.com/office/word/2026/wordml/cei" xmlns:w16cex="http://schemas.microsoft.com/office/word/2018/wordml/cex" xmlns:w16cid="http://schemas.microsoft.com/office/word/2016/wordml/cid" xmlns:w16="http://schemas.microsoft.com/office/word/2018/wordml" xmlns:w16du="http://schemas.microsoft.com/office/word/2023/wordml/word16du" xmlns:w16sdtdh="http://schemas.microsoft.com/office/word/2020/wordml/sdtdatahash" xmlns:w16sdtfl="http://schemas.microsoft.com/office/word/2024/wordml/sdtformatlock" xmlns:w16se="http://schemas.microsoft.com/office/word/2015/wordml/symex" xmlns:wpg="http://schemas.microsoft.com/office/word/2010/wordprocessingGroup" xmlns:wpi="http://schemas.microsoft.com/office/word/2010/wordprocessingInk" xmlns:wne="http://schemas.microsoft.com/office/word/2006/wordml" xmlns:wps="http://schemas.microsoft.com/office/word/2010/wordprocessingShape" mc:Ignorable="w14 w15 w16se w16cid w16 w16cex w16sdtdh w16sdtfl w16du wp14">
   <w:sdt>
     <w:sdtPr>
@@ -3080,7 +5342,7 @@
 </w:hdr>
 </file>
 
-<file path=word/numbering.xml><?xml version="1.0" encoding="utf-8"?>
+<file path=word\numbering.xml><?xml version="1.0" encoding="utf-8"?>
 <w:numbering xmlns:wpc="http://schemas.microsoft.com/office/word/2010/wordprocessingCanvas" xmlns:cx="http://schemas.microsoft.com/office/drawing/2014/chartex" xmlns:cx1="http://schemas.microsoft.com/office/drawing/2015/9/8/chartex" xmlns:cx2="http://schemas.microsoft.com/office/drawing/2015/10/21/chartex" xmlns:cx3="http://schemas.microsoft.com/office/drawing/2016/5/9/chartex" xmlns:cx4="http://schemas.microsoft.com/office/drawing/2016/5/10/chartex" xmlns:cx5="http://schemas.microsoft.com/office/drawing/2016/5/11/chartex" xmlns:cx6="http://schemas.microsoft.com/office/drawing/2016/5/12/chartex" xmlns:cx7="http://schemas.microsoft.com/office/drawing/2016/5/13/chartex" xmlns:cx8="http://schemas.microsoft.com/office/drawing/2016/5/14/chartex" xmlns:mc="http://schemas.openxmlformats.org/markup-compatibility/2006" xmlns:aink="http://schemas.microsoft.com/office/drawing/2016/ink" xmlns:am3d="http://schemas.microsoft.com/office/drawing/2017/model3d" xmlns:o="urn:schemas-microsoft-com:office:office" xmlns:oel="http://schemas.microsoft.com/office/2019/extlst" xmlns:r="http://schemas.openxmlformats.org/officeDocument/2006/relationships" xmlns:m="http://schemas.openxmlformats.org/officeDocument/2006/math" xmlns:v="urn:schemas-microsoft-com:vml" xmlns:wp14="http://schemas.microsoft.com/office/word/2010/wordprocessingDrawing" xmlns:wp="http://schemas.openxmlformats.org/drawingml/2006/wordprocessingDrawing" xmlns:w10="urn:schemas-microsoft-com:office:word" xmlns:w="http://schemas.openxmlformats.org/wordprocessingml/2006/main" xmlns:w14="http://schemas.microsoft.com/office/word/2010/wordml" xmlns:w15="http://schemas.microsoft.com/office/word/2012/wordml" xmlns:w16cei="http://schemas.microsoft.com/office/word/2026/wordml/cei" xmlns:w16cex="http://schemas.microsoft.com/office/word/2018/wordml/cex" xmlns:w16cid="http://schemas.microsoft.com/office/word/2016/wordml/cid" xmlns:w16="http://schemas.microsoft.com/office/word/2018/wordml" xmlns:w16du="http://schemas.microsoft.com/office/word/2023/wordml/word16du" xmlns:w16sdtdh="http://schemas.microsoft.com/office/word/2020/wordml/sdtdatahash" xmlns:w16sdtfl="http://schemas.microsoft.com/office/word/2024/wordml/sdtformatlock" xmlns:w16se="http://schemas.microsoft.com/office/word/2015/wordml/symex" xmlns:wpg="http://schemas.microsoft.com/office/word/2010/wordprocessingGroup" xmlns:wpi="http://schemas.microsoft.com/office/word/2010/wordprocessingInk" xmlns:wne="http://schemas.microsoft.com/office/word/2006/wordml" xmlns:wps="http://schemas.microsoft.com/office/word/2010/wordprocessingShape" mc:Ignorable="w14 w15 w16se w16cid w16 w16cex w16sdtdh w16sdtfl w16du wp14">
   <w:abstractNum w:abstractNumId="0" w15:restartNumberingAfterBreak="0">
     <w:nsid w:val="005E4A37"/>
@@ -5213,7 +7475,628 @@
 </w:numbering>
 </file>
 
-<file path=word/styles.xml><?xml version="1.0" encoding="utf-8"?>
+<file path=word\settings.xml><?xml version="1.0" encoding="utf-8"?>
+<w:settings xmlns:mc="http://schemas.openxmlformats.org/markup-compatibility/2006" xmlns:o="urn:schemas-microsoft-com:office:office" xmlns:r="http://schemas.openxmlformats.org/officeDocument/2006/relationships" xmlns:m="http://schemas.openxmlformats.org/officeDocument/2006/math" xmlns:v="urn:schemas-microsoft-com:vml" xmlns:w10="urn:schemas-microsoft-com:office:word" xmlns:w="http://schemas.openxmlformats.org/wordprocessingml/2006/main" xmlns:w14="http://schemas.microsoft.com/office/word/2010/wordml" xmlns:w15="http://schemas.microsoft.com/office/word/2012/wordml" xmlns:w16cex="http://schemas.microsoft.com/office/word/2018/wordml/cex" xmlns:w16cid="http://schemas.microsoft.com/office/word/2016/wordml/cid" xmlns:w16="http://schemas.microsoft.com/office/word/2018/wordml" xmlns:w16du="http://schemas.microsoft.com/office/word/2023/wordml/word16du" xmlns:w16sdtdh="http://schemas.microsoft.com/office/word/2020/wordml/sdtdatahash" xmlns:w16sdtfl="http://schemas.microsoft.com/office/word/2024/wordml/sdtformatlock" xmlns:w16se="http://schemas.microsoft.com/office/word/2015/wordml/symex" xmlns:sl="http://schemas.openxmlformats.org/schemaLibrary/2006/main" mc:Ignorable="w14 w15 w16se w16cid w16 w16cex w16sdtdh w16sdtfl w16du">
+  <w:zoom w:percent="100"/>
+  <w:proofState w:spelling="clean" w:grammar="clean"/>
+  <w:stylePaneFormatFilter w:val="3F01" w:allStyles="1" w:customStyles="0" w:latentStyles="0" w:stylesInUse="0" w:headingStyles="0" w:numberingStyles="0" w:tableStyles="0" w:directFormattingOnRuns="1" w:directFormattingOnParagraphs="1" w:directFormattingOnNumbering="1" w:directFormattingOnTables="1" w:clearFormatting="1" w:top3HeadingStyles="1" w:visibleStyles="0" w:alternateStyleNames="0"/>
+  <w:defaultTabStop w:val="708"/>
+  <w:hyphenationZone w:val="425"/>
+  <w:noPunctuationKerning/>
+  <w:characterSpacingControl w:val="doNotCompress"/>
+  <w:hdrShapeDefaults>
+    <o:shapedefaults v:ext="edit" spidmax="2050"/>
+  </w:hdrShapeDefaults>
+  <w:footnotePr>
+    <w:footnote w:id="-1"/>
+    <w:footnote w:id="0"/>
+  </w:footnotePr>
+  <w:endnotePr>
+    <w:endnote w:id="-1"/>
+    <w:endnote w:id="0"/>
+  </w:endnotePr>
+  <w:compat>
+    <w:applyBreakingRules/>
+    <w:useFELayout/>
+    <w:compatSetting w:name="compatibilityMode" w:uri="http://schemas.microsoft.com/office/word" w:val="15"/>
+    <w:compatSetting w:name="overrideTableStyleFontSizeAndJustification" w:uri="http://schemas.microsoft.com/office/word" w:val="1"/>
+    <w:compatSetting w:name="enableOpenTypeFeatures" w:uri="http://schemas.microsoft.com/office/word" w:val="1"/>
+    <w:compatSetting w:name="doNotFlipMirrorIndents" w:uri="http://schemas.microsoft.com/office/word" w:val="1"/>
+    <w:compatSetting w:name="differentiateMultirowTableHeaders" w:uri="http://schemas.microsoft.com/office/word" w:val="1"/>
+    <w:compatSetting w:name="useWord2013TrackBottomHyphenation" w:uri="http://schemas.microsoft.com/office/word" w:val="0"/>
+  </w:compat>
+  <w:rsids>
+    <w:rsidRoot w:val="006A678E"/>
+    <w:rsid w:val="00004B63"/>
+    <w:rsid w:val="0000634C"/>
+    <w:rsid w:val="000068BB"/>
+    <w:rsid w:val="00016575"/>
+    <w:rsid w:val="00016FC9"/>
+    <w:rsid w:val="00027331"/>
+    <w:rsid w:val="000317F5"/>
+    <w:rsid w:val="00046E29"/>
+    <w:rsid w:val="0005027D"/>
+    <w:rsid w:val="0005137D"/>
+    <w:rsid w:val="00055D06"/>
+    <w:rsid w:val="00064E72"/>
+    <w:rsid w:val="00065DC8"/>
+    <w:rsid w:val="00087F1E"/>
+    <w:rsid w:val="00095F8C"/>
+    <w:rsid w:val="00096411"/>
+    <w:rsid w:val="000A2090"/>
+    <w:rsid w:val="000A57E4"/>
+    <w:rsid w:val="000B144B"/>
+    <w:rsid w:val="000C123D"/>
+    <w:rsid w:val="000C698B"/>
+    <w:rsid w:val="000C77D9"/>
+    <w:rsid w:val="000C7F60"/>
+    <w:rsid w:val="000D542C"/>
+    <w:rsid w:val="000E540D"/>
+    <w:rsid w:val="000F0FBF"/>
+    <w:rsid w:val="000F6268"/>
+    <w:rsid w:val="000F669F"/>
+    <w:rsid w:val="001029E7"/>
+    <w:rsid w:val="00103EE3"/>
+    <w:rsid w:val="001116CF"/>
+    <w:rsid w:val="001201F7"/>
+    <w:rsid w:val="00121987"/>
+    <w:rsid w:val="00124498"/>
+    <w:rsid w:val="0012588F"/>
+    <w:rsid w:val="00131646"/>
+    <w:rsid w:val="00132CAD"/>
+    <w:rsid w:val="00133808"/>
+    <w:rsid w:val="00134A53"/>
+    <w:rsid w:val="0013507C"/>
+    <w:rsid w:val="001419F7"/>
+    <w:rsid w:val="00147264"/>
+    <w:rsid w:val="001762A7"/>
+    <w:rsid w:val="00180E75"/>
+    <w:rsid w:val="00181CC1"/>
+    <w:rsid w:val="00184F19"/>
+    <w:rsid w:val="00190EEF"/>
+    <w:rsid w:val="00191291"/>
+    <w:rsid w:val="00191699"/>
+    <w:rsid w:val="001A036A"/>
+    <w:rsid w:val="001B0F1A"/>
+    <w:rsid w:val="001C116D"/>
+    <w:rsid w:val="001C66BC"/>
+    <w:rsid w:val="001D0626"/>
+    <w:rsid w:val="001D4D75"/>
+    <w:rsid w:val="001E4658"/>
+    <w:rsid w:val="001F0193"/>
+    <w:rsid w:val="001F37CB"/>
+    <w:rsid w:val="001F4715"/>
+    <w:rsid w:val="001F5F11"/>
+    <w:rsid w:val="001F6617"/>
+    <w:rsid w:val="00201F83"/>
+    <w:rsid w:val="00206C26"/>
+    <w:rsid w:val="00221A05"/>
+    <w:rsid w:val="00225DA2"/>
+    <w:rsid w:val="00227157"/>
+    <w:rsid w:val="00227369"/>
+    <w:rsid w:val="00230387"/>
+    <w:rsid w:val="00230FA4"/>
+    <w:rsid w:val="00235A92"/>
+    <w:rsid w:val="002369F3"/>
+    <w:rsid w:val="00240B40"/>
+    <w:rsid w:val="002418B5"/>
+    <w:rsid w:val="00243C48"/>
+    <w:rsid w:val="00245DD8"/>
+    <w:rsid w:val="002511BD"/>
+    <w:rsid w:val="002535FB"/>
+    <w:rsid w:val="00262A7F"/>
+    <w:rsid w:val="00262C34"/>
+    <w:rsid w:val="00266B11"/>
+    <w:rsid w:val="002672FB"/>
+    <w:rsid w:val="00275F9C"/>
+    <w:rsid w:val="0029177C"/>
+    <w:rsid w:val="00297B2B"/>
+    <w:rsid w:val="002A11D0"/>
+    <w:rsid w:val="002A1ADD"/>
+    <w:rsid w:val="002A3424"/>
+    <w:rsid w:val="002A5972"/>
+    <w:rsid w:val="002A77A3"/>
+    <w:rsid w:val="002B39C9"/>
+    <w:rsid w:val="002B3D25"/>
+    <w:rsid w:val="002C0E3B"/>
+    <w:rsid w:val="002C63B9"/>
+    <w:rsid w:val="002D1F2D"/>
+    <w:rsid w:val="002D5FA2"/>
+    <w:rsid w:val="002E0504"/>
+    <w:rsid w:val="002E2555"/>
+    <w:rsid w:val="002F0BD5"/>
+    <w:rsid w:val="002F382F"/>
+    <w:rsid w:val="003036FF"/>
+    <w:rsid w:val="00311C76"/>
+    <w:rsid w:val="00320241"/>
+    <w:rsid w:val="00320C0C"/>
+    <w:rsid w:val="0032424A"/>
+    <w:rsid w:val="003313C9"/>
+    <w:rsid w:val="00331C94"/>
+    <w:rsid w:val="003331AF"/>
+    <w:rsid w:val="00334127"/>
+    <w:rsid w:val="00351C7E"/>
+    <w:rsid w:val="0036075F"/>
+    <w:rsid w:val="00361151"/>
+    <w:rsid w:val="00366A9E"/>
+    <w:rsid w:val="00371CE3"/>
+    <w:rsid w:val="00372A08"/>
+    <w:rsid w:val="0037365B"/>
+    <w:rsid w:val="00373C92"/>
+    <w:rsid w:val="0038248F"/>
+    <w:rsid w:val="00383119"/>
+    <w:rsid w:val="00385232"/>
+    <w:rsid w:val="003855C0"/>
+    <w:rsid w:val="00386977"/>
+    <w:rsid w:val="00387700"/>
+    <w:rsid w:val="003919BC"/>
+    <w:rsid w:val="0039250E"/>
+    <w:rsid w:val="00396F75"/>
+    <w:rsid w:val="003A28E0"/>
+    <w:rsid w:val="003B1A8B"/>
+    <w:rsid w:val="003B23A9"/>
+    <w:rsid w:val="003B791F"/>
+    <w:rsid w:val="003B7C6A"/>
+    <w:rsid w:val="003C215E"/>
+    <w:rsid w:val="003C798A"/>
+    <w:rsid w:val="003D0E82"/>
+    <w:rsid w:val="003D77EF"/>
+    <w:rsid w:val="003E03BB"/>
+    <w:rsid w:val="003E464B"/>
+    <w:rsid w:val="003E5F24"/>
+    <w:rsid w:val="003F17BF"/>
+    <w:rsid w:val="003F346A"/>
+    <w:rsid w:val="00403893"/>
+    <w:rsid w:val="00411B4E"/>
+    <w:rsid w:val="00412D0F"/>
+    <w:rsid w:val="00415336"/>
+    <w:rsid w:val="00415D2F"/>
+    <w:rsid w:val="00416F70"/>
+    <w:rsid w:val="00425A41"/>
+    <w:rsid w:val="0043246B"/>
+    <w:rsid w:val="00432F60"/>
+    <w:rsid w:val="00442E16"/>
+    <w:rsid w:val="004457C5"/>
+    <w:rsid w:val="00447E7B"/>
+    <w:rsid w:val="00452F96"/>
+    <w:rsid w:val="00454A51"/>
+    <w:rsid w:val="004556DB"/>
+    <w:rsid w:val="00455772"/>
+    <w:rsid w:val="00455FED"/>
+    <w:rsid w:val="00463646"/>
+    <w:rsid w:val="00463D7B"/>
+    <w:rsid w:val="004728BD"/>
+    <w:rsid w:val="00480179"/>
+    <w:rsid w:val="004930DB"/>
+    <w:rsid w:val="00493637"/>
+    <w:rsid w:val="00493963"/>
+    <w:rsid w:val="004950FA"/>
+    <w:rsid w:val="004A006A"/>
+    <w:rsid w:val="004A355A"/>
+    <w:rsid w:val="004A58EA"/>
+    <w:rsid w:val="004A7291"/>
+    <w:rsid w:val="004B1614"/>
+    <w:rsid w:val="004C03F7"/>
+    <w:rsid w:val="004C1671"/>
+    <w:rsid w:val="004C23F5"/>
+    <w:rsid w:val="004C51D1"/>
+    <w:rsid w:val="004D1D46"/>
+    <w:rsid w:val="004D7C0E"/>
+    <w:rsid w:val="004E17C2"/>
+    <w:rsid w:val="004E308F"/>
+    <w:rsid w:val="004E4348"/>
+    <w:rsid w:val="004E46F4"/>
+    <w:rsid w:val="004E5A20"/>
+    <w:rsid w:val="004E65C5"/>
+    <w:rsid w:val="004E6E64"/>
+    <w:rsid w:val="004F2953"/>
+    <w:rsid w:val="004F7C7C"/>
+    <w:rsid w:val="0050132C"/>
+    <w:rsid w:val="00506A9A"/>
+    <w:rsid w:val="0050713F"/>
+    <w:rsid w:val="00510B84"/>
+    <w:rsid w:val="00516FBA"/>
+    <w:rsid w:val="0051743C"/>
+    <w:rsid w:val="00521869"/>
+    <w:rsid w:val="00522BFE"/>
+    <w:rsid w:val="00522C04"/>
+    <w:rsid w:val="00527AE7"/>
+    <w:rsid w:val="00530B91"/>
+    <w:rsid w:val="00533F10"/>
+    <w:rsid w:val="00540967"/>
+    <w:rsid w:val="005426D3"/>
+    <w:rsid w:val="00544593"/>
+    <w:rsid w:val="0055299A"/>
+    <w:rsid w:val="00556690"/>
+    <w:rsid w:val="0056023E"/>
+    <w:rsid w:val="00565DCE"/>
+    <w:rsid w:val="00574D25"/>
+    <w:rsid w:val="00582DEB"/>
+    <w:rsid w:val="00585FD9"/>
+    <w:rsid w:val="00596E44"/>
+    <w:rsid w:val="005A4C0A"/>
+    <w:rsid w:val="005B2AEF"/>
+    <w:rsid w:val="005B4D59"/>
+    <w:rsid w:val="005C0B25"/>
+    <w:rsid w:val="005C1F52"/>
+    <w:rsid w:val="005C7D25"/>
+    <w:rsid w:val="005D1FED"/>
+    <w:rsid w:val="005E6AA9"/>
+    <w:rsid w:val="005E7EEB"/>
+    <w:rsid w:val="005F1B75"/>
+    <w:rsid w:val="005F47C5"/>
+    <w:rsid w:val="005F4CE7"/>
+    <w:rsid w:val="005F61BB"/>
+    <w:rsid w:val="005F6EA2"/>
+    <w:rsid w:val="00603D9B"/>
+    <w:rsid w:val="0060477F"/>
+    <w:rsid w:val="00604898"/>
+    <w:rsid w:val="0060558F"/>
+    <w:rsid w:val="00605B6B"/>
+    <w:rsid w:val="00612F54"/>
+    <w:rsid w:val="006354E5"/>
+    <w:rsid w:val="00642126"/>
+    <w:rsid w:val="00642961"/>
+    <w:rsid w:val="00642DE1"/>
+    <w:rsid w:val="00652BE4"/>
+    <w:rsid w:val="0066356C"/>
+    <w:rsid w:val="0066442B"/>
+    <w:rsid w:val="006644F2"/>
+    <w:rsid w:val="006654E1"/>
+    <w:rsid w:val="00673CF0"/>
+    <w:rsid w:val="00677561"/>
+    <w:rsid w:val="00683014"/>
+    <w:rsid w:val="00690CB0"/>
+    <w:rsid w:val="00695A74"/>
+    <w:rsid w:val="00697C4E"/>
+    <w:rsid w:val="006A6576"/>
+    <w:rsid w:val="006A678E"/>
+    <w:rsid w:val="006B7E15"/>
+    <w:rsid w:val="006C01D1"/>
+    <w:rsid w:val="006D2685"/>
+    <w:rsid w:val="006D3D4A"/>
+    <w:rsid w:val="006D3F37"/>
+    <w:rsid w:val="006E0664"/>
+    <w:rsid w:val="006E7DA6"/>
+    <w:rsid w:val="006F0DBA"/>
+    <w:rsid w:val="006F13C0"/>
+    <w:rsid w:val="007017D3"/>
+    <w:rsid w:val="00702021"/>
+    <w:rsid w:val="00705D36"/>
+    <w:rsid w:val="0070634F"/>
+    <w:rsid w:val="00707958"/>
+    <w:rsid w:val="00707E99"/>
+    <w:rsid w:val="0071303A"/>
+    <w:rsid w:val="00713908"/>
+    <w:rsid w:val="007224A0"/>
+    <w:rsid w:val="00742685"/>
+    <w:rsid w:val="00747D22"/>
+    <w:rsid w:val="00750C48"/>
+    <w:rsid w:val="007523A5"/>
+    <w:rsid w:val="007558AF"/>
+    <w:rsid w:val="00763AF2"/>
+    <w:rsid w:val="007641A7"/>
+    <w:rsid w:val="00770597"/>
+    <w:rsid w:val="00784AFA"/>
+    <w:rsid w:val="00785FE7"/>
+    <w:rsid w:val="00794222"/>
+    <w:rsid w:val="007951B3"/>
+    <w:rsid w:val="00795AF7"/>
+    <w:rsid w:val="00797189"/>
+    <w:rsid w:val="007A40F8"/>
+    <w:rsid w:val="007B4D46"/>
+    <w:rsid w:val="007C0E77"/>
+    <w:rsid w:val="007C4899"/>
+    <w:rsid w:val="007C4D7F"/>
+    <w:rsid w:val="007C6AA7"/>
+    <w:rsid w:val="007C7A2E"/>
+    <w:rsid w:val="007D0935"/>
+    <w:rsid w:val="007D65E8"/>
+    <w:rsid w:val="007D7090"/>
+    <w:rsid w:val="007F3079"/>
+    <w:rsid w:val="007F3BAE"/>
+    <w:rsid w:val="007F74FB"/>
+    <w:rsid w:val="007F7D10"/>
+    <w:rsid w:val="0081678E"/>
+    <w:rsid w:val="00822242"/>
+    <w:rsid w:val="00822C60"/>
+    <w:rsid w:val="00827C8C"/>
+    <w:rsid w:val="0083691E"/>
+    <w:rsid w:val="008374F5"/>
+    <w:rsid w:val="00840C07"/>
+    <w:rsid w:val="008467F2"/>
+    <w:rsid w:val="00851056"/>
+    <w:rsid w:val="008520E6"/>
+    <w:rsid w:val="008528D4"/>
+    <w:rsid w:val="0086467A"/>
+    <w:rsid w:val="008677C0"/>
+    <w:rsid w:val="00877B5A"/>
+    <w:rsid w:val="00880B2D"/>
+    <w:rsid w:val="00882EBB"/>
+    <w:rsid w:val="00883A66"/>
+    <w:rsid w:val="00885D27"/>
+    <w:rsid w:val="00891C79"/>
+    <w:rsid w:val="0089255D"/>
+    <w:rsid w:val="00893787"/>
+    <w:rsid w:val="00894EEA"/>
+    <w:rsid w:val="008A260A"/>
+    <w:rsid w:val="008A59FF"/>
+    <w:rsid w:val="008A7430"/>
+    <w:rsid w:val="008B4007"/>
+    <w:rsid w:val="008C3E5B"/>
+    <w:rsid w:val="008C70A3"/>
+    <w:rsid w:val="008D0344"/>
+    <w:rsid w:val="008D247C"/>
+    <w:rsid w:val="008D2F9B"/>
+    <w:rsid w:val="008D4883"/>
+    <w:rsid w:val="008E28D5"/>
+    <w:rsid w:val="008E2EDD"/>
+    <w:rsid w:val="008F33E5"/>
+    <w:rsid w:val="009015DF"/>
+    <w:rsid w:val="00902AF1"/>
+    <w:rsid w:val="00903E09"/>
+    <w:rsid w:val="009052E4"/>
+    <w:rsid w:val="00910483"/>
+    <w:rsid w:val="00912166"/>
+    <w:rsid w:val="00921C7D"/>
+    <w:rsid w:val="009241BA"/>
+    <w:rsid w:val="00925BA2"/>
+    <w:rsid w:val="009304F4"/>
+    <w:rsid w:val="0093573F"/>
+    <w:rsid w:val="00942CDC"/>
+    <w:rsid w:val="00945D6E"/>
+    <w:rsid w:val="00951EA3"/>
+    <w:rsid w:val="00953561"/>
+    <w:rsid w:val="00953C13"/>
+    <w:rsid w:val="00957E88"/>
+    <w:rsid w:val="00965306"/>
+    <w:rsid w:val="00974AA7"/>
+    <w:rsid w:val="00975BBF"/>
+    <w:rsid w:val="009765AA"/>
+    <w:rsid w:val="0097791B"/>
+    <w:rsid w:val="00980604"/>
+    <w:rsid w:val="00982DA1"/>
+    <w:rsid w:val="00991AF8"/>
+    <w:rsid w:val="00994ED8"/>
+    <w:rsid w:val="009A586F"/>
+    <w:rsid w:val="009A6477"/>
+    <w:rsid w:val="009B168A"/>
+    <w:rsid w:val="009B2F5E"/>
+    <w:rsid w:val="009B7856"/>
+    <w:rsid w:val="009C0EB8"/>
+    <w:rsid w:val="009C3DFB"/>
+    <w:rsid w:val="009D04A2"/>
+    <w:rsid w:val="009D63C4"/>
+    <w:rsid w:val="00A009C9"/>
+    <w:rsid w:val="00A018DA"/>
+    <w:rsid w:val="00A032EE"/>
+    <w:rsid w:val="00A043E5"/>
+    <w:rsid w:val="00A062A5"/>
+    <w:rsid w:val="00A075DF"/>
+    <w:rsid w:val="00A13476"/>
+    <w:rsid w:val="00A14D9B"/>
+    <w:rsid w:val="00A15A6A"/>
+    <w:rsid w:val="00A16488"/>
+    <w:rsid w:val="00A21FD2"/>
+    <w:rsid w:val="00A27A88"/>
+    <w:rsid w:val="00A33B7E"/>
+    <w:rsid w:val="00A37868"/>
+    <w:rsid w:val="00A41A75"/>
+    <w:rsid w:val="00A46BE3"/>
+    <w:rsid w:val="00A509DB"/>
+    <w:rsid w:val="00A53BFF"/>
+    <w:rsid w:val="00A66DD3"/>
+    <w:rsid w:val="00A81DDF"/>
+    <w:rsid w:val="00A82711"/>
+    <w:rsid w:val="00A85989"/>
+    <w:rsid w:val="00A905FD"/>
+    <w:rsid w:val="00A972AF"/>
+    <w:rsid w:val="00A97DA8"/>
+    <w:rsid w:val="00AA1766"/>
+    <w:rsid w:val="00AA3306"/>
+    <w:rsid w:val="00AA5DF4"/>
+    <w:rsid w:val="00AB5827"/>
+    <w:rsid w:val="00AC23C8"/>
+    <w:rsid w:val="00AC319A"/>
+    <w:rsid w:val="00AC500D"/>
+    <w:rsid w:val="00AC63B0"/>
+    <w:rsid w:val="00AD215D"/>
+    <w:rsid w:val="00AD4BEF"/>
+    <w:rsid w:val="00AD59C6"/>
+    <w:rsid w:val="00AD7B02"/>
+    <w:rsid w:val="00AE08A1"/>
+    <w:rsid w:val="00AE3663"/>
+    <w:rsid w:val="00AE47BD"/>
+    <w:rsid w:val="00AE6EE2"/>
+    <w:rsid w:val="00AF3A6E"/>
+    <w:rsid w:val="00B067CD"/>
+    <w:rsid w:val="00B10569"/>
+    <w:rsid w:val="00B10E5A"/>
+    <w:rsid w:val="00B13106"/>
+    <w:rsid w:val="00B15509"/>
+    <w:rsid w:val="00B16A48"/>
+    <w:rsid w:val="00B20AE4"/>
+    <w:rsid w:val="00B541DB"/>
+    <w:rsid w:val="00B5487C"/>
+    <w:rsid w:val="00B668E4"/>
+    <w:rsid w:val="00B71B03"/>
+    <w:rsid w:val="00B9003D"/>
+    <w:rsid w:val="00B92CFF"/>
+    <w:rsid w:val="00B94F10"/>
+    <w:rsid w:val="00B95FAD"/>
+    <w:rsid w:val="00BA59FD"/>
+    <w:rsid w:val="00BA769C"/>
+    <w:rsid w:val="00BB136F"/>
+    <w:rsid w:val="00BB1D91"/>
+    <w:rsid w:val="00BB384B"/>
+    <w:rsid w:val="00BC0ED9"/>
+    <w:rsid w:val="00BD28AA"/>
+    <w:rsid w:val="00BD5E26"/>
+    <w:rsid w:val="00BD7DF0"/>
+    <w:rsid w:val="00BF0048"/>
+    <w:rsid w:val="00BF503E"/>
+    <w:rsid w:val="00C0053E"/>
+    <w:rsid w:val="00C1674D"/>
+    <w:rsid w:val="00C20E19"/>
+    <w:rsid w:val="00C260BD"/>
+    <w:rsid w:val="00C40C28"/>
+    <w:rsid w:val="00C44860"/>
+    <w:rsid w:val="00C44FE5"/>
+    <w:rsid w:val="00C46753"/>
+    <w:rsid w:val="00C46EF1"/>
+    <w:rsid w:val="00C473EE"/>
+    <w:rsid w:val="00C537BC"/>
+    <w:rsid w:val="00C55475"/>
+    <w:rsid w:val="00C5745B"/>
+    <w:rsid w:val="00C65A80"/>
+    <w:rsid w:val="00C7101B"/>
+    <w:rsid w:val="00C72441"/>
+    <w:rsid w:val="00C7652A"/>
+    <w:rsid w:val="00C7716A"/>
+    <w:rsid w:val="00C81711"/>
+    <w:rsid w:val="00CA6AD9"/>
+    <w:rsid w:val="00CB0E7B"/>
+    <w:rsid w:val="00CB220C"/>
+    <w:rsid w:val="00CB22EE"/>
+    <w:rsid w:val="00CB55F5"/>
+    <w:rsid w:val="00CC3CD2"/>
+    <w:rsid w:val="00CD300A"/>
+    <w:rsid w:val="00CD41E3"/>
+    <w:rsid w:val="00CE06F6"/>
+    <w:rsid w:val="00CE49A4"/>
+    <w:rsid w:val="00CF0EF8"/>
+    <w:rsid w:val="00CF12D2"/>
+    <w:rsid w:val="00CF1FFF"/>
+    <w:rsid w:val="00CF2F4E"/>
+    <w:rsid w:val="00CF3B3F"/>
+    <w:rsid w:val="00CF45B6"/>
+    <w:rsid w:val="00D040C6"/>
+    <w:rsid w:val="00D05413"/>
+    <w:rsid w:val="00D05445"/>
+    <w:rsid w:val="00D146C9"/>
+    <w:rsid w:val="00D24933"/>
+    <w:rsid w:val="00D27BCF"/>
+    <w:rsid w:val="00D37B2B"/>
+    <w:rsid w:val="00D4086F"/>
+    <w:rsid w:val="00D40A2E"/>
+    <w:rsid w:val="00D44ED4"/>
+    <w:rsid w:val="00D4695E"/>
+    <w:rsid w:val="00D54CB8"/>
+    <w:rsid w:val="00D5730C"/>
+    <w:rsid w:val="00D62814"/>
+    <w:rsid w:val="00D62E19"/>
+    <w:rsid w:val="00D65170"/>
+    <w:rsid w:val="00D70139"/>
+    <w:rsid w:val="00D77346"/>
+    <w:rsid w:val="00D910FA"/>
+    <w:rsid w:val="00D941EF"/>
+    <w:rsid w:val="00D9644A"/>
+    <w:rsid w:val="00DA092C"/>
+    <w:rsid w:val="00DA27C6"/>
+    <w:rsid w:val="00DA4291"/>
+    <w:rsid w:val="00DB2716"/>
+    <w:rsid w:val="00DB2B92"/>
+    <w:rsid w:val="00DC06C8"/>
+    <w:rsid w:val="00DD0317"/>
+    <w:rsid w:val="00DD0D80"/>
+    <w:rsid w:val="00DD4434"/>
+    <w:rsid w:val="00DD5AFF"/>
+    <w:rsid w:val="00DE21F5"/>
+    <w:rsid w:val="00DE674C"/>
+    <w:rsid w:val="00DE7700"/>
+    <w:rsid w:val="00DF0A4C"/>
+    <w:rsid w:val="00E064AA"/>
+    <w:rsid w:val="00E14A45"/>
+    <w:rsid w:val="00E1693F"/>
+    <w:rsid w:val="00E232F8"/>
+    <w:rsid w:val="00E26E0A"/>
+    <w:rsid w:val="00E3056B"/>
+    <w:rsid w:val="00E35817"/>
+    <w:rsid w:val="00E36698"/>
+    <w:rsid w:val="00E37C74"/>
+    <w:rsid w:val="00E52275"/>
+    <w:rsid w:val="00E53D77"/>
+    <w:rsid w:val="00E60887"/>
+    <w:rsid w:val="00E725A4"/>
+    <w:rsid w:val="00E73C96"/>
+    <w:rsid w:val="00E75B37"/>
+    <w:rsid w:val="00E775A4"/>
+    <w:rsid w:val="00E82584"/>
+    <w:rsid w:val="00E86B2B"/>
+    <w:rsid w:val="00E90B4F"/>
+    <w:rsid w:val="00E92AC8"/>
+    <w:rsid w:val="00EA48DA"/>
+    <w:rsid w:val="00EA6926"/>
+    <w:rsid w:val="00EB0971"/>
+    <w:rsid w:val="00EB1FEE"/>
+    <w:rsid w:val="00EB2968"/>
+    <w:rsid w:val="00EB3A4E"/>
+    <w:rsid w:val="00EB79E2"/>
+    <w:rsid w:val="00EC4B9B"/>
+    <w:rsid w:val="00ED05BC"/>
+    <w:rsid w:val="00ED2022"/>
+    <w:rsid w:val="00EE731A"/>
+    <w:rsid w:val="00EE7E6F"/>
+    <w:rsid w:val="00EF5A81"/>
+    <w:rsid w:val="00F01D91"/>
+    <w:rsid w:val="00F05D35"/>
+    <w:rsid w:val="00F0777B"/>
+    <w:rsid w:val="00F10662"/>
+    <w:rsid w:val="00F10D18"/>
+    <w:rsid w:val="00F22605"/>
+    <w:rsid w:val="00F26B01"/>
+    <w:rsid w:val="00F27270"/>
+    <w:rsid w:val="00F40AE0"/>
+    <w:rsid w:val="00F654AF"/>
+    <w:rsid w:val="00F67634"/>
+    <w:rsid w:val="00F709C0"/>
+    <w:rsid w:val="00F72222"/>
+    <w:rsid w:val="00F808DF"/>
+    <w:rsid w:val="00F8403C"/>
+    <w:rsid w:val="00F924B6"/>
+    <w:rsid w:val="00F936C9"/>
+    <w:rsid w:val="00FA2462"/>
+    <w:rsid w:val="00FA2EBB"/>
+    <w:rsid w:val="00FB29E9"/>
+    <w:rsid w:val="00FB5593"/>
+    <w:rsid w:val="00FC0E66"/>
+    <w:rsid w:val="00FC244F"/>
+    <w:rsid w:val="00FC7829"/>
+    <w:rsid w:val="00FD2978"/>
+    <w:rsid w:val="00FD7A7D"/>
+    <w:rsid w:val="00FF1EEB"/>
+    <w:rsid w:val="00FF64AB"/>
+  </w:rsids>
+  <m:mathPr>
+    <m:mathFont m:val="Cambria Math"/>
+    <m:brkBin m:val="before"/>
+    <m:brkBinSub m:val="--"/>
+    <m:smallFrac m:val="0"/>
+    <m:dispDef/>
+    <m:lMargin m:val="0"/>
+    <m:rMargin m:val="0"/>
+    <m:defJc m:val="centerGroup"/>
+    <m:wrapIndent m:val="1440"/>
+    <m:intLim m:val="subSup"/>
+    <m:naryLim m:val="undOvr"/>
+  </m:mathPr>
+  <w:themeFontLang w:val="pt-BR"/>
+  <w:clrSchemeMapping w:bg1="light1" w:t1="dark1" w:bg2="light2" w:t2="dark2" w:accent1="accent1" w:accent2="accent2" w:accent3="accent3" w:accent4="accent4" w:accent5="accent5" w:accent6="accent6" w:hyperlink="hyperlink" w:followedHyperlink="followedHyperlink"/>
+  <w:doNotIncludeSubdocsInStats/>
+  <w:shapeDefaults>
+    <o:shapedefaults v:ext="edit" spidmax="2050"/>
+    <o:shapelayout v:ext="edit">
+      <o:idmap v:ext="edit" data="2"/>
+    </o:shapelayout>
+  </w:shapeDefaults>
+  <w:decimalSymbol w:val=","/>
+  <w:listSeparator w:val=";"/>
+  <w14:docId w14:val="58AD11FB"/>
+  <w15:docId w15:val="{94FD17E7-CF45-41A5-A183-E3C08A70C2FD}"/>
+</w:settings>
+</file>
+
+<file path=word\styles.xml><?xml version="1.0" encoding="utf-8"?>
 <w:styles xmlns:mc="http://schemas.openxmlformats.org/markup-compatibility/2006" xmlns:r="http://schemas.openxmlformats.org/officeDocument/2006/relationships" xmlns:w="http://schemas.openxmlformats.org/wordprocessingml/2006/main" xmlns:w14="http://schemas.microsoft.com/office/word/2010/wordml" xmlns:w15="http://schemas.microsoft.com/office/word/2012/wordml" xmlns:w16cex="http://schemas.microsoft.com/office/word/2018/wordml/cex" xmlns:w16cid="http://schemas.microsoft.com/office/word/2016/wordml/cid" xmlns:w16="http://schemas.microsoft.com/office/word/2018/wordml" xmlns:w16du="http://schemas.microsoft.com/office/word/2023/wordml/word16du" xmlns:w16sdtdh="http://schemas.microsoft.com/office/word/2020/wordml/sdtdatahash" xmlns:w16sdtfl="http://schemas.microsoft.com/office/word/2024/wordml/sdtformatlock" xmlns:w16se="http://schemas.microsoft.com/office/word/2015/wordml/symex" mc:Ignorable="w14 w15 w16se w16cid w16 w16cex w16sdtdh w16sdtfl w16du">
   <w:docDefaults>
     <w:rPrDefault>
@@ -6102,7 +8985,7 @@
 </w:styles>
 </file>
 
-<file path=word/theme/theme1.xml><?xml version="1.0" encoding="utf-8"?>
+<file path=word\theme\theme1.xml><?xml version="1.0" encoding="utf-8"?>
 <a:theme xmlns:a="http://schemas.openxmlformats.org/drawingml/2006/main" name="Tema do Office">
   <a:themeElements>
     <a:clrScheme name="Escritório">
@@ -6387,14 +9270,8 @@
 </a:theme>
 </file>
 
-<file path=customXml/item1.xml><?xml version="1.0" encoding="utf-8"?>
-<b:Sources xmlns:b="http://schemas.openxmlformats.org/officeDocument/2006/bibliography" xmlns="http://schemas.openxmlformats.org/officeDocument/2006/bibliography" SelectedStyle="\APA.XSL" StyleName="APA"/>
-</file>
-
-<file path=customXml/itemProps1.xml><?xml version="1.0" encoding="utf-8"?>
-<ds:datastoreItem xmlns:ds="http://schemas.openxmlformats.org/officeDocument/2006/customXml" ds:itemID="{EE4BC9EC-644D-4D87-AFC8-3A05FD12D9F8}">
-  <ds:schemaRefs>
-    <ds:schemaRef ds:uri="http://schemas.openxmlformats.org/officeDocument/2006/bibliography"/>
-  </ds:schemaRefs>
-</ds:datastoreItem>
+<file path=word\webSettings.xml><?xml version="1.0" encoding="utf-8"?>
+<w:webSettings xmlns:mc="http://schemas.openxmlformats.org/markup-compatibility/2006" xmlns:r="http://schemas.openxmlformats.org/officeDocument/2006/relationships" xmlns:w="http://schemas.openxmlformats.org/wordprocessingml/2006/main" xmlns:w14="http://schemas.microsoft.com/office/word/2010/wordml" xmlns:w15="http://schemas.microsoft.com/office/word/2012/wordml" xmlns:w16cex="http://schemas.microsoft.com/office/word/2018/wordml/cex" xmlns:w16cid="http://schemas.microsoft.com/office/word/2016/wordml/cid" xmlns:w16="http://schemas.microsoft.com/office/word/2018/wordml" xmlns:w16du="http://schemas.microsoft.com/office/word/2023/wordml/word16du" xmlns:w16sdtdh="http://schemas.microsoft.com/office/word/2020/wordml/sdtdatahash" xmlns:w16sdtfl="http://schemas.microsoft.com/office/word/2024/wordml/sdtformatlock" xmlns:w16se="http://schemas.microsoft.com/office/word/2015/wordml/symex" mc:Ignorable="w14 w15 w16se w16cid w16 w16cex w16sdtdh w16sdtfl w16du">
+  <w:optimizeForBrowser/>
+</w:webSettings>
 </file>
</xml_diff>